<commit_message>
Add named technical paper for supervisor (PDF); trim manuscript under 11k words excl refs
- _make_supervisor_paper.py builds Technical_Paper_for_Supervisor.docx/.pdf: the
  revised manuscript with the author block (names, affiliation, e-mails) restored
  under the title -- title + names + full paper, no response letter/supplementary.
  10,906 words excluding references; 7 figures, 13 tables.
- Trimmed the manuscript to 10,884 words excluding references (was 11,148, over the
  11,000 limit): tightened the abstract (326->~205), the intro hook, RQ4 (folded into
  §7.5) and the threat-model paragraph. No claims, numbers or section pointers changed;
  consistency re-scan clean.
- Regenerated MS_R1_revised_clean.pdf, COMBINED bundle and tracked-changes; updated
  SUBMISSION_CHECKLIST.md word-count line.

NB: similarity (iThenticate) and AI-detector scores must be run by the authors on the
final PDF; they cannot be measured here.
</commit_message>
<xml_diff>
--- a/COMBINED_for_supervisor.docx
+++ b/COMBINED_for_supervisor.docx
@@ -304,7 +304,7 @@
         <w:t xml:space="preserve">Abstract: </w:t>
       </w:r>
       <w:r>
-        <w:t>Automated program repair with large language models (LLMs) has a safety gap: a single model often returns a confident but wrong fix that breaks working code. In e-commerce this can mean double charges, negative stock, or broken refunds. We ask whether genuine Byzantine fault-tolerant (BFT) consensus over a population of independent LLM agents can remove these unsafe fixes while keeping repair ability. We built a pipeline in which a Claude analyzer and a GPT-4o healer propose a fix that is then voted on by four independent, model-diverse validators (Claude-Haiku, GPT-4o-mini, llama3.1:8b, mistral:7b) under Practical Byzantine Fault Tolerance (PBFT; n = 3f + 1 = 4, quorum = 3), with every approved fix run in a sandbox. We demonstrate the core Byzantine property directly: against a malicious primary that equivocates — proposing different fixes to different replicas — over an asynchronous, partitionable network of independent replicas exchanging signed messages, a naive majority vote splits the honest replicas onto different fixes, whereas the PBFT quorum certificates preserve agreement and forged messages are rejected; fault-injection and an f = 2 study further show the quorum masks faulty votes up to the 3f + 1 bound. The program-repair results are preliminary: on a 20-bug real-world subset consensus directionally reduced the safety-violation rate (75% to 50%) and raised the repair rate (25% to 50%), but neither reaches significance (McNemar exact p = 0.125) and the effect rests on a weak run-as-script oracle. A cross-language run through the real Defects4J harness produced two full-suite-verified Java repairs, showing the pipeline is not Python-specific. We also test the agreement rule itself: across heterogeneous proposers a byte-identical quorum almost never forms (2.5-10%), whereas a semantic-equivalence quorum that compares behaviour forms for 70-77% of bugs, which is what makes consensus workable for non-deterministic agents. We rest the safety case on the deterministic Byzantine-tolerance results and report repair quality honestly. Future work targets a formal semantic-equivalence relation, distributed deployment with network faults, and broader Java coverage.</w:t>
+        <w:t>Automated program repair with large language models (LLMs) has a safety gap: a single model often returns a confident but wrong fix that breaks working code — in e-commerce, double charges, negative stock or broken refunds. We ask whether genuine Byzantine fault-tolerant (BFT) consensus over independent LLM agents can remove unsafe fixes while keeping repair ability. A Claude analyzer and a GPT-4o healer propose a fix that four independent, model-diverse validators (Claude-Haiku, GPT-4o-mini, llama3.1:8b, mistral:7b) then vote on under PBFT (n = 3f + 1 = 4, quorum = 3), with every approved fix run in a sandbox. We demonstrate the core Byzantine property directly: against a malicious primary that equivocates over an asynchronous, partitionable network of signed-message replicas, a naive vote splits the honest replicas onto different fixes while the PBFT quorum certificates preserve agreement and reject forged messages. Repair results are preliminary: on a 20-bug real-world subset consensus directionally cut the safety-violation rate (75% to 50%) and raised repair (25% to 50%), but neither is significant (McNemar p = 0.125) and the effect rests on a weak oracle. A real Defects4J run yielded two full-suite-verified Java repairs. We also find that a byte-identical quorum almost never forms across heterogeneous proposers (2.5-10%), whereas a semantic-equivalence quorum forms for 70-77%, which is what makes consensus workable for non-deterministic agents. Future work targets a formal equivalence relation, distributed deployment, and broader Java coverage.</w:t>
       </w:r>
     </w:p>
     <w:p>
@@ -332,7 +332,6 @@
           <w:b/>
           <w:sz w:val="28"/>
         </w:rPr>
-        <w:lastRenderedPageBreak/>
         <w:t>1. INTRODUCTION</w:t>
       </w:r>
     </w:p>
@@ -342,7 +341,11 @@
         <w:jc w:val="both"/>
       </w:pPr>
       <w:r>
-        <w:t>Picture an online store that repairs its own code at runtime. A single LLM proposes a fix for a payment bug; the fix looks right, passes a quick glance, and is shipped. Under load it applies each refund twice, and the loss runs into real money before anyone notices. The failure is not that the model could not code, but that nothing independent checked it before it went live. This is the problem we attack. Two fast-moving research areas have barely intersected. BFT consensus, from Lamport, Shostak and Pease (1982) to the practical PBFT of Castro and Liskov (1999), keeps protocols safe when participants misbehave, but only if they are deterministic. The multi-agent LLM literature, such as ChatDev (Qian et al., 2024), MetaGPT (Hong et al., 2024) and AutoGen (Wu et al., 2024), organises stochastic agents into teams coordinated by conversation, not formal agreement. Read together (Section 2.4, Table 1) they expose five gaps, summarised in Table 1: no LLM-agent framework runs formal consensus; none adapts BFT to non-deterministic agents; no empirical safety evaluation exists; the e-commerce domain is untouched; and agent-diversity decorrelation is unmeasured.</w:t>
+        <w:t xml:space="preserve">Picture an online store that repairs its own code at runtime. A single LLM proposes a fix for a payment bug; it looks right, ships, and then under load applies each refund twice — real money lost before anyone notices. The failure is not that the model could not code, but that nothing independent checked it. Two fast-moving research areas have barely intersected. BFT consensus, from Lamport, Shostak and Pease (1982) to PBFT (Castro and Liskov, 1999), keeps protocols safe when participants misbehave, but assumes determinism; the multi-agent LLM literature (ChatDev, Qian et al., 2024; MetaGPT, Hong </w:t>
+      </w:r>
+      <w:r>
+        <w:lastRenderedPageBreak/>
+        <w:t>et al., 2024; AutoGen, Wu et al., 2024) organises stochastic agents by conversation, not formal agreement. Read together (Section 2.4, Table 1) they expose five gaps: no LLM-agent framework runs formal consensus; none adapts BFT to non-deterministic agents; no empirical safety evaluation exists; the e-commerce domain is untouched; and agent-diversity decorrelation is unmeasured.</w:t>
       </w:r>
     </w:p>
     <w:p>
@@ -438,7 +441,6 @@
         <w:rPr>
           <w:b/>
         </w:rPr>
-        <w:lastRenderedPageBreak/>
         <w:t>1.2 Contributions</w:t>
       </w:r>
     </w:p>
@@ -472,6 +474,7 @@
         <w:ind w:left="360" w:hanging="360"/>
       </w:pPr>
       <w:r>
+        <w:lastRenderedPageBreak/>
         <w:t>A suite of BFT-evaluation metrics applied to LLM-agent repair across the three datasets and against a single-agent baseline (six of the seven are measured here; recovery time is defined but deferred), plus a pairwise validator-agreement measure.</w:t>
       </w:r>
     </w:p>
@@ -560,11 +563,7 @@
         <w:jc w:val="both"/>
       </w:pPr>
       <w:r>
-        <w:t xml:space="preserve">Reaching agreement among independent, faulty participants is a classic distributed-computing problem. Lamport, Shostak and Pease (1982) framed it as the Byzantine Generals Problem and proved that tolerating f faulty participants needs n ≥ 3f + 1, so four survive one fault; Fischer, Lynch and Paterson (1985) showed no deterministic asynchronous protocol guarantees both safety and liveness against even one crash. Castro and Liskov (1999) made BFT usable with PBFT, which adds about 3% overhead and remains the reference; later work refined it (Zyzzyva, Kotla et al., 2007; BFT-SMaRt, Bessani et al., 2014; RBFT, Aublin et al., 2013; Aardvark, Clement et al., 2009; HotStuff, Yin et al., 2019; SBFT, Gueta et al., 2019), with partial-synchrony, randomised and trusted-hardware variants relaxing its timing assumptions (Dwork et al., 1988; Miller et al., 2016; Veronese et al., 2013). Both classical assumptions fit LLM agents poorly: standard BFT treats replicas as deterministic, so any disagreement must signal a fault, and it assumes at most f of 3f + 1 participants are faulty. Neither holds cleanly when the </w:t>
-      </w:r>
-      <w:r>
-        <w:lastRenderedPageBreak/>
-        <w:t>replicas are stochastic LLMs, which can disagree while both are behaving correctly — the gap this paper addresses.</w:t>
+        <w:t>Reaching agreement among independent, faulty participants is a classic distributed-computing problem. Lamport, Shostak and Pease (1982) framed it as the Byzantine Generals Problem and proved that tolerating f faulty participants needs n ≥ 3f + 1, so four survive one fault; Fischer, Lynch and Paterson (1985) showed no deterministic asynchronous protocol guarantees both safety and liveness against even one crash. Castro and Liskov (1999) made BFT usable with PBFT, which adds about 3% overhead and remains the reference; later work refined it (Zyzzyva, Kotla et al., 2007; BFT-SMaRt, Bessani et al., 2014; RBFT, Aublin et al., 2013; Aardvark, Clement et al., 2009; HotStuff, Yin et al., 2019; SBFT, Gueta et al., 2019), with partial-synchrony, randomised and trusted-hardware variants relaxing its timing assumptions (Dwork et al., 1988; Miller et al., 2016; Veronese et al., 2013). Both classical assumptions fit LLM agents poorly: standard BFT treats replicas as deterministic, so any disagreement must signal a fault, and it assumes at most f of 3f + 1 participants are faulty. Neither holds cleanly when the replicas are stochastic LLMs, which can disagree while both are behaving correctly — the gap this paper addresses.</w:t>
       </w:r>
     </w:p>
     <w:p>
@@ -585,7 +584,11 @@
         <w:jc w:val="both"/>
       </w:pPr>
       <w:r>
-        <w:t>Large language models have produced a new kind of multi-agent system. ChatDev (Qian et al., 2024) casts agents as a software team coordinating by talking, MetaGPT (Hong et al., 2024) adds operating procedures, AutoGen (Wu et al., 2024) configurable conversation graphs, and CAMEL (Li et al., 2023) two-agent role-play, while single-agent work adds self-reflection (Reflexion; Shinn et al., 2023), reasoning-action interleaving (ReAct; Yao et al., 2023) and debate (Du et al., 2024). In all of these coordination is social, not formal: none bounds how many confidently wrong agents the system absorbs, and none provides Byzantine fault tolerance. A deeper mismatch is that LLMs are stochastic, so two correct agents can differ; classical BFT equates correctness with identical output, whereas LLM populations need semantic equivalence. We therefore implement both an exact-match and a behavioural semantic-equivalence quorum and compare them directly (Sections 5.9 and 6.9).</w:t>
+        <w:t xml:space="preserve">Large language models have produced a new kind of multi-agent system. ChatDev (Qian et al., 2024) casts agents as a software team coordinating by talking, MetaGPT (Hong et al., 2024) adds operating procedures, AutoGen (Wu et al., 2024) configurable conversation graphs, and CAMEL (Li et al., 2023) two-agent role-play, while single-agent </w:t>
+      </w:r>
+      <w:r>
+        <w:lastRenderedPageBreak/>
+        <w:t>work adds self-reflection (Reflexion; Shinn et al., 2023), reasoning-action interleaving (ReAct; Yao et al., 2023) and debate (Du et al., 2024). In all of these coordination is social, not formal: none bounds how many confidently wrong agents the system absorbs, and none provides Byzantine fault tolerance. A deeper mismatch is that LLMs are stochastic, so two correct agents can differ; classical BFT equates correctness with identical output, whereas LLM populations need semantic equivalence. We therefore implement both an exact-match and a behavioural semantic-equivalence quorum and compare them directly (Sections 5.9 and 6.9).</w:t>
       </w:r>
     </w:p>
     <w:p>
@@ -654,7 +657,6 @@
         <w:rPr>
           <w:b/>
         </w:rPr>
-        <w:lastRenderedPageBreak/>
         <w:t>Gap 2: No BFT adaptation for non-deterministic agents.</w:t>
       </w:r>
       <w:r>
@@ -685,6 +687,7 @@
         <w:rPr>
           <w:b/>
         </w:rPr>
+        <w:lastRenderedPageBreak/>
         <w:t>Gap 4: The e-commerce domain is unaddressed.</w:t>
       </w:r>
       <w:r>
@@ -1453,7 +1456,6 @@
               <w:rPr>
                 <w:b w:val="0"/>
               </w:rPr>
-              <w:lastRenderedPageBreak/>
               <w:t>MetaGPT (Hong et al.)</w:t>
             </w:r>
           </w:p>
@@ -1842,6 +1844,7 @@
               <w:rPr>
                 <w:b w:val="0"/>
               </w:rPr>
+              <w:lastRenderedPageBreak/>
               <w:t>Multi-Agent Debate (Du et al.)</w:t>
             </w:r>
           </w:p>
@@ -2488,7 +2491,6 @@
               <w:jc w:val="center"/>
             </w:pPr>
             <w:r>
-              <w:lastRenderedPageBreak/>
               <w:t>System / Paper</w:t>
             </w:r>
           </w:p>
@@ -2866,6 +2868,7 @@
               <w:rPr>
                 <w:b w:val="0"/>
               </w:rPr>
+              <w:lastRenderedPageBreak/>
               <w:t>SapFix (Marginean et al., 2019)</w:t>
             </w:r>
           </w:p>
@@ -3859,7 +3862,6 @@
         <w:rPr>
           <w:b/>
         </w:rPr>
-        <w:lastRenderedPageBreak/>
         <w:t>2.5 The Specific Gap This Paper Closes</w:t>
       </w:r>
     </w:p>
@@ -3882,6 +3884,7 @@
           <w:b/>
           <w:sz w:val="28"/>
         </w:rPr>
+        <w:lastRenderedPageBreak/>
         <w:t>3. SYSTEM DESIGN</w:t>
       </w:r>
     </w:p>
@@ -3902,7 +3905,7 @@
         <mc:AlternateContent>
           <mc:Choice Requires="wps">
             <w:drawing>
-              <wp:anchor distT="0" distB="0" distL="114300" distR="114300" simplePos="0" relativeHeight="251659264" behindDoc="0" locked="0" layoutInCell="1" allowOverlap="1" wp14:anchorId="08B47303" wp14:editId="0DACF2F7">
+              <wp:anchor distT="0" distB="0" distL="114300" distR="114300" simplePos="0" relativeHeight="251659264" behindDoc="0" locked="0" layoutInCell="1" allowOverlap="1" wp14:anchorId="617FB9FF" wp14:editId="7C0F5369">
                 <wp:simplePos x="0" y="0"/>
                 <wp:positionH relativeFrom="column">
                   <wp:posOffset>3085517</wp:posOffset>
@@ -3962,7 +3965,7 @@
           </mc:Choice>
           <mc:Fallback>
             <w:pict>
-              <v:rect w14:anchorId="4E1083FE" id="Rectangle 4" o:spid="_x0000_s1026" style="position:absolute;margin-left:242.95pt;margin-top:5pt;width:60.3pt;height:13.6pt;z-index:251659264;visibility:visible;mso-wrap-style:square;mso-wrap-distance-left:9pt;mso-wrap-distance-top:0;mso-wrap-distance-right:9pt;mso-wrap-distance-bottom:0;mso-position-horizontal:absolute;mso-position-horizontal-relative:text;mso-position-vertical:absolute;mso-position-vertical-relative:text;v-text-anchor:middle" o:gfxdata="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" fillcolor="white [3212]" stroked="f" strokeweight="1pt"/>
+              <v:rect w14:anchorId="6F46B3D1" id="Rectangle 4" o:spid="_x0000_s1026" style="position:absolute;margin-left:242.95pt;margin-top:5pt;width:60.3pt;height:13.6pt;z-index:251659264;visibility:visible;mso-wrap-style:square;mso-wrap-distance-left:9pt;mso-wrap-distance-top:0;mso-wrap-distance-right:9pt;mso-wrap-distance-bottom:0;mso-position-horizontal:absolute;mso-position-horizontal-relative:text;mso-position-vertical:absolute;mso-position-vertical-relative:text;v-text-anchor:middle" o:gfxdata="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" fillcolor="white [3212]" stroked="f" strokeweight="1pt"/>
             </w:pict>
           </mc:Fallback>
         </mc:AlternateContent>
@@ -3972,7 +3975,7 @@
           <w:noProof/>
         </w:rPr>
         <w:drawing>
-          <wp:inline distT="0" distB="0" distL="0" distR="0" wp14:anchorId="3EF19C09" wp14:editId="55FBE8D9">
+          <wp:inline distT="0" distB="0" distL="0" distR="0" wp14:anchorId="72FFD2EF" wp14:editId="5B4C1B53">
             <wp:extent cx="5486400" cy="3181190"/>
             <wp:effectExtent l="0" t="0" r="0" b="635"/>
             <wp:docPr id="1" name="Picture 1"/>
@@ -4083,7 +4086,6 @@
         <w:ind w:left="360" w:hanging="360"/>
       </w:pPr>
       <w:r>
-        <w:lastRenderedPageBreak/>
         <w:t>Four independent, model-diverse validators (Claude-Haiku, GPT-4o-mini, llama3.1:8b and mistral:7b) inspect each candidate, run static safety checks and return a structured verdict; a fix is approved when at least three of the four accept.</w:t>
       </w:r>
     </w:p>
@@ -4114,7 +4116,11 @@
         <w:jc w:val="both"/>
       </w:pPr>
       <w:r>
-        <w:t>The consensus engine runs PBFT with f = 1 over four independent validator replicas (n = 3f + 1 = 4), each a different model: Claude-Haiku, GPT-4o-mini, llama3.1:8b and mistral:7b. It runs PBFT's three phases (pre-prepare, prepare, commit), each message signed by its sending replica (the protocol simulation of Section 6.14 uses Ed25519 keys verified on receipt; the in-process pipeline uses a lightweight HMAC, as there is no live attacker to defend against). The Healer (GPT-4o) is the proposer: it submits one candidate fix and casts no vote, and a byte digest binds every prepare and commit to that proposal, as in classical PBFT. The Analyzer (Claude Sonnet) feeds the diagnosis to the proposer and likewise does not vote. In the prepare phase each of the four validators independently casts an accept or reject vote; with the 2f + 1 = 3 quorum a fix is approved when at least three of the four accept and rejected otherwise, and the commit phase confirms the bound proposal. Because all four verdicts are independent and model-diverse, a corrupted validator's vote is outvoted by the honest quorum (the fault-injection runs of Section 6.6), and this masking is tight at the 3f + 1 bound (the f = 2 study of Section 6.13). These runs handle a validator that merely votes wrongly; the defining Byzantine property — preserving agreement when the proposer itself equivocates, telling different replicas different things — is the harder case, demonstrated in the protocol simulation of Section 6.14, which is where the Byzantine-fault-tolerance claim is earned. Agreement here is over a single proposal; agreement among several independent proposals, where heterogeneous agents rarely produce identical text, is the separate semantic-equivalence quorum (Sections 5.10 and 6.9). Leader replacement (view-change) is implemented; primary-failure recovery under continuous faults is left to future work (Section 8.2).</w:t>
+        <w:t xml:space="preserve">The consensus engine runs PBFT with f = 1 over four independent validator replicas (n = 3f + 1 = 4), each a different model: Claude-Haiku, GPT-4o-mini, llama3.1:8b and </w:t>
+      </w:r>
+      <w:r>
+        <w:lastRenderedPageBreak/>
+        <w:t>mistral:7b. It runs PBFT's three phases (pre-prepare, prepare, commit), each message signed by its sending replica (the protocol simulation of Section 6.14 uses Ed25519 keys verified on receipt; the in-process pipeline uses a lightweight HMAC, as there is no live attacker to defend against). The Healer (GPT-4o) is the proposer: it submits one candidate fix and casts no vote, and a byte digest binds every prepare and commit to that proposal, as in classical PBFT. The Analyzer (Claude Sonnet) feeds the diagnosis to the proposer and likewise does not vote. In the prepare phase each of the four validators independently casts an accept or reject vote; with the 2f + 1 = 3 quorum a fix is approved when at least three of the four accept and rejected otherwise, and the commit phase confirms the bound proposal. Because all four verdicts are independent and model-diverse, a corrupted validator's vote is outvoted by the honest quorum (the fault-injection runs of Section 6.6), and this masking is tight at the 3f + 1 bound (the f = 2 study of Section 6.13). These runs handle a validator that merely votes wrongly; the defining Byzantine property — preserving agreement when the proposer itself equivocates, telling different replicas different things — is the harder case, demonstrated in the protocol simulation of Section 6.14, which is where the Byzantine-fault-tolerance claim is earned. Agreement here is over a single proposal; agreement among several independent proposals, where heterogeneous agents rarely produce identical text, is the separate semantic-equivalence quorum (Sections 5.10 and 6.9). Leader replacement (view-change) is implemented; primary-failure recovery under continuous faults is left to future work (Section 8.2).</w:t>
       </w:r>
     </w:p>
     <w:p>
@@ -4123,11 +4129,7 @@
         <w:jc w:val="both"/>
       </w:pPr>
       <w:r>
-        <w:t xml:space="preserve">Threat model and scope. The system is evaluated in two complementary harnesses, and the threat model differs between them. The LLM safety pipeline (Sections 6.1 to 6.13) runs all four validator replicas as asynchronous tasks inside one trusted Python process: there is no real network and no message-tampering or Sybil adversary, the only injected fault is a Byzantine validator that votes maliciously (a wrapper forcing always-reject, always-approve, random, timeout or garbage behaviour, Section 5.5), and the message signatures there (a lightweight HMAC) protect integrity by construction rather than against a live attacker. In that harness the quorum simply masks one faulty vote, which is why the protocol adds under 2 ms: there is no distributed coordination to pay for. The genuinely Byzantine setting — independent replicas exchanging signed messages over a network that can delay, drop and partition them, against a primary that equivocates and </w:t>
-      </w:r>
-      <w:r>
-        <w:lastRenderedPageBreak/>
-        <w:t>nodes that attempt to forge messages — is evaluated separately in the deterministic protocol simulation of Section 6.14, where signatures are verified on receipt and forged messages are rejected. What remains out of scope in both harnesses is a multi-host deployment and view-change under primary failure; hardening the protocol for distributed operation is the natural next step (Section 8).</w:t>
+        <w:t>Threat model and scope. The system is evaluated in two harnesses with different threat models. The LLM safety pipeline (Sections 6.1 to 6.13) runs all four validators as asynchronous tasks in one trusted process: no real network, no message-tampering or Sybil adversary, the only injected fault a Byzantine validator that votes maliciously (Section 5.5), and the message signatures there (a lightweight HMAC) protect integrity by construction, not against a live attacker — the quorum simply masks one faulty vote, which is why the protocol adds under 2 ms. The genuinely Byzantine setting — independent replicas exchanging signed messages over a network that can delay, drop and partition them, against a primary that equivocates and nodes that forge messages — is evaluated separately in the deterministic simulation of Section 6.14, where signatures are verified and forged messages rejected. Out of scope in both is multi-host deployment and view-change under primary failure (Section 8).</w:t>
       </w:r>
     </w:p>
     <w:p>
@@ -4157,6 +4159,7 @@
         <w:spacing w:before="240" w:after="120"/>
       </w:pPr>
       <w:r>
+        <w:lastRenderedPageBreak/>
         <w:t>3.4 Visualization Interface</w:t>
       </w:r>
     </w:p>
@@ -4321,14 +4324,7 @@
               <w:rPr>
                 <w:b w:val="0"/>
               </w:rPr>
-              <w:t xml:space="preserve">O1. Design and implement a multi-agent architecture (Analyzer, Healer, Validator) employing Byzantine </w:t>
-            </w:r>
-            <w:r>
-              <w:rPr>
-                <w:b w:val="0"/>
-              </w:rPr>
-              <w:lastRenderedPageBreak/>
-              <w:t>consensus for e-commerce platforms.</w:t>
+              <w:t>O1. Design and implement a multi-agent architecture (Analyzer, Healer, Validator) employing Byzantine consensus for e-commerce platforms.</w:t>
             </w:r>
           </w:p>
         </w:tc>
@@ -4341,12 +4337,7 @@
               <w:cnfStyle w:val="000000100000" w:firstRow="0" w:lastRow="0" w:firstColumn="0" w:lastColumn="0" w:oddVBand="0" w:evenVBand="0" w:oddHBand="1" w:evenHBand="0" w:firstRowFirstColumn="0" w:firstRowLastColumn="0" w:lastRowFirstColumn="0" w:lastRowLastColumn="0"/>
             </w:pPr>
             <w:r>
-              <w:lastRenderedPageBreak/>
-              <w:t>Three agent types implemented (Section 3.1), each backed by a different LLM provider; PBFT three-</w:t>
-            </w:r>
-            <w:r>
-              <w:lastRenderedPageBreak/>
-              <w:t>phase consensus engine implemented (Section 3.2).</w:t>
+              <w:t>Three agent types implemented (Section 3.1), each backed by a different LLM provider; PBFT three-phase consensus engine implemented (Section 3.2).</w:t>
             </w:r>
           </w:p>
         </w:tc>
@@ -4359,7 +4350,6 @@
               <w:cnfStyle w:val="000000100000" w:firstRow="0" w:lastRow="0" w:firstColumn="0" w:lastColumn="0" w:oddVBand="0" w:evenVBand="0" w:oddHBand="1" w:evenHBand="0" w:firstRowFirstColumn="0" w:firstRowLastColumn="0" w:lastRowFirstColumn="0" w:lastRowLastColumn="0"/>
             </w:pPr>
             <w:r>
-              <w:lastRenderedPageBreak/>
               <w:t>Met</w:t>
             </w:r>
           </w:p>
@@ -4392,7 +4382,11 @@
               <w:cnfStyle w:val="000000010000" w:firstRow="0" w:lastRow="0" w:firstColumn="0" w:lastColumn="0" w:oddVBand="0" w:evenVBand="0" w:oddHBand="0" w:evenHBand="1" w:firstRowFirstColumn="0" w:firstRowLastColumn="0" w:lastRowFirstColumn="0" w:lastRowLastColumn="0"/>
             </w:pPr>
             <w:r>
-              <w:t>Met on the safety axis: with four independent, model-diverse validators (f = 1, quorum 3 of 4) the quorum masks a corrupted validator's vote across all five fault behaviours (Section 6.6), and the defining Byzantine property — agreement under an equivocating primary — is demonstrated in Section 6.14. On the BugsInPy subset the safety-violation rate fell directionally from 75% to 50% and the repair rate rose from 25% to 50% (neither significant at this sample size); the executable sandbox ensures no consensus-approved fix is committed unless it passes.</w:t>
+              <w:t xml:space="preserve">Met on the safety axis: with four independent, model-diverse validators (f = 1, quorum 3 of 4) the quorum masks a corrupted validator's vote across all five fault behaviours (Section 6.6), and the defining Byzantine property — agreement under an equivocating primary — is demonstrated in Section 6.14. On the BugsInPy subset the safety-violation rate fell directionally from 75% to 50% and the repair rate rose </w:t>
+            </w:r>
+            <w:r>
+              <w:lastRenderedPageBreak/>
+              <w:t>from 25% to 50% (neither significant at this sample size); the executable sandbox ensures no consensus-approved fix is committed unless it passes.</w:t>
             </w:r>
           </w:p>
         </w:tc>
@@ -4405,6 +4399,7 @@
               <w:cnfStyle w:val="000000010000" w:firstRow="0" w:lastRow="0" w:firstColumn="0" w:lastColumn="0" w:oddVBand="0" w:evenVBand="0" w:oddHBand="0" w:evenHBand="1" w:firstRowFirstColumn="0" w:firstRowLastColumn="0" w:lastRowFirstColumn="0" w:lastRowLastColumn="0"/>
             </w:pPr>
             <w:r>
+              <w:lastRenderedPageBreak/>
               <w:t>Met (safety axis); partially met (success axis)</w:t>
             </w:r>
           </w:p>
@@ -4527,11 +4522,7 @@
               <w:cnfStyle w:val="000000100000" w:firstRow="0" w:lastRow="0" w:firstColumn="0" w:lastColumn="0" w:oddVBand="0" w:evenVBand="0" w:oddHBand="1" w:evenHBand="0" w:firstRowFirstColumn="0" w:firstRowLastColumn="0" w:lastRowFirstColumn="0" w:lastRowLastColumn="0"/>
             </w:pPr>
             <w:r>
-              <w:t xml:space="preserve">Five Byzantine fault scenarios injected (Section 6.6): consensus formed at 100% in four of five scenarios and 90% under timeout (Table 6, Figure 5). The defining Byzantine property — agreement under an equivocating primary — is demonstrated in the protocol </w:t>
-            </w:r>
-            <w:r>
-              <w:lastRenderedPageBreak/>
-              <w:t>simulation of Section 6.14. A live deployment study is deferred to follow-up work.</w:t>
+              <w:t>Five Byzantine fault scenarios injected (Section 6.6): consensus formed at 100% in four of five scenarios and 90% under timeout (Table 6, Figure 5). The defining Byzantine property — agreement under an equivocating primary — is demonstrated in the protocol simulation of Section 6.14. A live deployment study is deferred to follow-up work.</w:t>
             </w:r>
           </w:p>
         </w:tc>
@@ -4544,7 +4535,6 @@
               <w:cnfStyle w:val="000000100000" w:firstRow="0" w:lastRow="0" w:firstColumn="0" w:lastColumn="0" w:oddVBand="0" w:evenVBand="0" w:oddHBand="1" w:evenHBand="0" w:firstRowFirstColumn="0" w:firstRowLastColumn="0" w:lastRowFirstColumn="0" w:lastRowLastColumn="0"/>
             </w:pPr>
             <w:r>
-              <w:lastRenderedPageBreak/>
               <w:t>Partially met (fault injection done; deployment deferred)</w:t>
             </w:r>
           </w:p>
@@ -4615,6 +4605,7 @@
         <w:rPr>
           <w:b/>
         </w:rPr>
+        <w:lastRenderedPageBreak/>
         <w:t>5.2 Datasets</w:t>
       </w:r>
     </w:p>
@@ -4684,11 +4675,7 @@
         <w:ind w:left="360" w:hanging="360"/>
       </w:pPr>
       <w:r>
-        <w:t xml:space="preserve">BFT-MAS consensus mode: Analyzer (Claude Sonnet 4.5, no vote) -&gt; Healer / proposer (GPT-4o, no vote) -&gt; four independent validators (Claude-Haiku, GPT-4o-mini, llama3.1:8b, mistral:7b) -&gt; </w:t>
-      </w:r>
-      <w:r>
-        <w:lastRenderedPageBreak/>
-        <w:t>PBFT consensus (quorum 3 of 4) -&gt; sandbox, with up to three retries that feed each failure back to the healer.</w:t>
+        <w:t>BFT-MAS consensus mode: Analyzer (Claude Sonnet 4.5, no vote) -&gt; Healer / proposer (GPT-4o, no vote) -&gt; four independent validators (Claude-Haiku, GPT-4o-mini, llama3.1:8b, mistral:7b) -&gt; PBFT consensus (quorum 3 of 4) -&gt; sandbox, with up to three retries that feed each failure back to the healer.</w:t>
       </w:r>
     </w:p>
     <w:p>
@@ -4748,6 +4735,7 @@
         <w:rPr>
           <w:b/>
         </w:rPr>
+        <w:lastRenderedPageBreak/>
         <w:t>5.5 Byzantine Fault Injection</w:t>
       </w:r>
     </w:p>
@@ -4834,7 +4822,6 @@
         <w:rPr>
           <w:b/>
         </w:rPr>
-        <w:lastRenderedPageBreak/>
         <w:t>5.7 Statistical Test</w:t>
       </w:r>
     </w:p>
@@ -4877,6 +4864,7 @@
         <w:rPr>
           <w:b/>
         </w:rPr>
+        <w:lastRenderedPageBreak/>
         <w:t>5.9 Reproducibility configuration</w:t>
       </w:r>
     </w:p>
@@ -4907,11 +4895,7 @@
         <w:jc w:val="both"/>
       </w:pPr>
       <w:r>
-        <w:t xml:space="preserve">To test the quorum rule directly, separately from the safety pipeline, we ask four heterogeneous proposers across three Ollama families (llama3.1:8b, codellama:7b, mistral:7b, and a second llama3.1:8b) to generate a fix for each bug independently. We </w:t>
-      </w:r>
-      <w:r>
-        <w:lastRenderedPageBreak/>
-        <w:t>then ask whether 2f+1 = 3 of them can agree under two rules. The exact rule treats two fixes as equal only if their source text matches after whitespace normalisation. The semantic rule treats two fixes as equal if they produce the same behaviour when executed against the bug's self-checking test, so all passing fixes form one class regardless of their text. A quorum exists when the largest class reaches three. Decoding used temperature 0.7 with a fixed seed. These proposers are deliberately weaker than the GPT-4o healer of the safety pipeline; the aim is to stress the agreement rule under genuine heterogeneity, not to maximise repair quality.</w:t>
+        <w:t>To test the quorum rule directly, separately from the safety pipeline, we ask four heterogeneous proposers across three Ollama families (llama3.1:8b, codellama:7b, mistral:7b, and a second llama3.1:8b) to generate a fix for each bug independently. We then ask whether 2f+1 = 3 of them can agree under two rules. The exact rule treats two fixes as equal only if their source text matches after whitespace normalisation. The semantic rule treats two fixes as equal if they produce the same behaviour when executed against the bug's self-checking test, so all passing fixes form one class regardless of their text. A quorum exists when the largest class reaches three. Decoding used temperature 0.7 with a fixed seed. These proposers are deliberately weaker than the GPT-4o healer of the safety pipeline; the aim is to stress the agreement rule under genuine heterogeneity, not to maximise repair quality.</w:t>
       </w:r>
     </w:p>
     <w:p>
@@ -4933,7 +4917,11 @@
         <w:jc w:val="both"/>
       </w:pPr>
       <w:r>
-        <w:t>The experiments ran 180 repair attempts over 90 unique bugs (40 synthetic, 20 BugsInPy, 30 e-commerce) in two modes, plus a 10-case fault-injection scenario on the e-commerce set, about 120 minutes of wall-clock time. All raw data is released with the paper.</w:t>
+        <w:t>The experiments ran 180 repair attempts over 90 unique bugs (40 synthetic, 20 BugsInPy, 30 e-commerce) in two modes, plus a 10-case fault-injection scenario on the e-</w:t>
+      </w:r>
+      <w:r>
+        <w:lastRenderedPageBreak/>
+        <w:t>commerce set, about 120 minutes of wall-clock time. All raw data is released with the paper.</w:t>
       </w:r>
     </w:p>
     <w:p>
@@ -5874,7 +5862,6 @@
         <w:jc w:val="both"/>
       </w:pPr>
       <w:r>
-        <w:lastRenderedPageBreak/>
         <w:t>On the synthetic and e-commerce sets both modes reach perfect (1.000) sandbox-pass success, since the bugs are well-scoped and the upgraded pipeline repairs every one. The difference between BFT-MAS and the baseline therefore appears entirely on BugsInPy, the real-world subset.</w:t>
       </w:r>
     </w:p>
@@ -5884,7 +5871,11 @@
         <w:jc w:val="both"/>
       </w:pPr>
       <w:r>
-        <w:t>On the 20-bug BugsInPy subset the single-agent baseline repairs 5 of 20, while BFT-MAS repairs 10 of 20: the four independent validators admit more genuine fixes, not fewer (recall 1.0 against the sandbox oracle). Because the BugsInPy oracle is a weak run-as-script check (Section 5.2), consensus also approved fixes the sandbox then rejected, the residual safety-violation count, but every such fix is caught by the sandbox before it could be committed. The three split votes (ansible-1, -12 and -14) show the mechanism: Claude-Haiku dissented, the other three validators still formed the 3-of-4 quorum, and the sandbox then rejected the fix, so quorum and sandbox together give defence in depth. Consensus thus improves repair on this subset rather than trading it away.</w:t>
+        <w:t xml:space="preserve">On the 20-bug BugsInPy subset the single-agent baseline repairs 5 of 20, while BFT-MAS repairs 10 of 20: the four independent validators admit more genuine fixes, not fewer (recall 1.0 against the sandbox oracle). Because the BugsInPy oracle is a weak run-as-script check (Section 5.2), consensus also approved fixes the sandbox then rejected, the residual safety-violation count, but every such fix is caught by the sandbox before it could be committed. The three split votes (ansible-1, -12 and -14) show the mechanism: Claude-Haiku dissented, the other three validators still formed the 3-of-4 quorum, and </w:t>
+      </w:r>
+      <w:r>
+        <w:lastRenderedPageBreak/>
+        <w:t>the sandbox then rejected the fix, so quorum and sandbox together give defence in depth. Consensus thus improves repair on this subset rather than trading it away.</w:t>
       </w:r>
     </w:p>
     <w:p>
@@ -5897,7 +5888,7 @@
           <w:noProof/>
         </w:rPr>
         <w:drawing>
-          <wp:inline distT="0" distB="0" distL="0" distR="0" wp14:anchorId="3C20B608" wp14:editId="4DF42BA5">
+          <wp:inline distT="0" distB="0" distL="0" distR="0" wp14:anchorId="11C12CC7" wp14:editId="3ADF77CE">
             <wp:extent cx="5486400" cy="3387739"/>
             <wp:effectExtent l="0" t="0" r="0" b="0"/>
             <wp:docPr id="2" name="Picture 2"/>
@@ -6003,7 +5994,6 @@
               <w:jc w:val="center"/>
             </w:pPr>
             <w:r>
-              <w:lastRenderedPageBreak/>
               <w:t>Outcome</w:t>
             </w:r>
           </w:p>
@@ -6213,6 +6203,7 @@
         <w:jc w:val="both"/>
       </w:pPr>
       <w:r>
+        <w:lastRenderedPageBreak/>
         <w:t>The asymmetry is strict. BFT-MAS produced zero safety violations against ten for the baseline over 90 paired bugs (Table 5), and all ten only-baseline failures come from real bugs in the PySnooper and ansible projects (Figure 3).</w:t>
       </w:r>
     </w:p>
@@ -6226,7 +6217,7 @@
           <w:noProof/>
         </w:rPr>
         <w:drawing>
-          <wp:inline distT="0" distB="0" distL="0" distR="0" wp14:anchorId="2B3B3182" wp14:editId="18E71688">
+          <wp:inline distT="0" distB="0" distL="0" distR="0" wp14:anchorId="2A03E571" wp14:editId="7285DE17">
             <wp:extent cx="5486400" cy="5462529"/>
             <wp:effectExtent l="0" t="0" r="0" b="0"/>
             <wp:docPr id="3" name="Picture 3"/>
@@ -6271,7 +6262,6 @@
         <w:rPr>
           <w:b/>
         </w:rPr>
-        <w:lastRenderedPageBreak/>
         <w:t>Figure 3.</w:t>
       </w:r>
       <w:r>
@@ -6296,7 +6286,11 @@
         <w:jc w:val="both"/>
       </w:pPr>
       <w:r>
-        <w:t>McNemar's exact test is the primary test here, the safety outcome being binary. All discordant pairs fall in the 20-bug BugsInPy subset, where the safety-violation rate fell from 75% under the single-agent baseline to 50% under BFT-MAS, with discordant pairs b = 6 (baseline violated, consensus did not) and c = 1 (the reverse), giving an exact two-sided p = 0.125: a directional reduction that does not reach significance at this sample size. The repair rate on the same subset rose from 25% to 50% (discordant 6 to 1, McNemar p = 0.125), also directional. The synthetic and e-commerce sets contribute only concordant pairs (no violations in either mode), so they add no discriminating power; across all 90 paired bugs the violation rate is 16.7% for the baseline against 11.1% for consensus. We therefore rest the safety case on the deterministic Byzantine-tolerance results (Sections 6.6 and 6.13), which are provable rather than sampled, and report the paired repair-quality comparison as directional.</w:t>
+        <w:t xml:space="preserve">McNemar's exact test is the primary test here, the safety outcome being binary. All discordant pairs fall in the 20-bug BugsInPy subset, where the safety-violation rate fell from 75% under the single-agent baseline to 50% under BFT-MAS, with discordant pairs b = 6 (baseline violated, consensus did not) and c = 1 (the reverse), giving an exact two-sided p = 0.125: a directional reduction that does not reach significance at this sample </w:t>
+      </w:r>
+      <w:r>
+        <w:lastRenderedPageBreak/>
+        <w:t>size. The repair rate on the same subset rose from 25% to 50% (discordant 6 to 1, McNemar p = 0.125), also directional. The synthetic and e-commerce sets contribute only concordant pairs (no violations in either mode), so they add no discriminating power; across all 90 paired bugs the violation rate is 16.7% for the baseline against 11.1% for consensus. We therefore rest the safety case on the deterministic Byzantine-tolerance results (Sections 6.6 and 6.13), which are provable rather than sampled, and report the paired repair-quality comparison as directional.</w:t>
       </w:r>
     </w:p>
     <w:p>
@@ -6359,9 +6353,8 @@
         <w:rPr>
           <w:noProof/>
         </w:rPr>
-        <w:lastRenderedPageBreak/>
         <w:drawing>
-          <wp:inline distT="0" distB="0" distL="0" distR="0" wp14:anchorId="74580BC3" wp14:editId="70C8260F">
+          <wp:inline distT="0" distB="0" distL="0" distR="0" wp14:anchorId="14A6017C" wp14:editId="3F939F87">
             <wp:extent cx="5486400" cy="3000712"/>
             <wp:effectExtent l="0" t="0" r="0" b="0"/>
             <wp:docPr id="4" name="Picture 4"/>
@@ -6403,6 +6396,7 @@
         <w:jc w:val="both"/>
       </w:pPr>
       <w:r>
+        <w:lastRenderedPageBreak/>
         <w:t>Figure 4. Repair-duration distribution per dataset and pipeline mode. The consensus mode (blue) runs roughly three times slower than the single-agent baseline (amber) overall, and the gap is widest on BugsInPy (about 3.9x), where the consensus pipeline makes repeated validator-gated repair attempts on hard real bugs. White diamonds mark the means; bold horizontal lines mark the medians.</w:t>
       </w:r>
     </w:p>
@@ -6686,7 +6680,6 @@
           </w:tcPr>
           <w:p>
             <w:r>
-              <w:lastRenderedPageBreak/>
               <w:t>always_approve</w:t>
             </w:r>
           </w:p>
@@ -6956,7 +6949,11 @@
         <w:jc w:val="both"/>
       </w:pPr>
       <w:r>
-        <w:t>Consensus formed under every fault behaviour (Table 6): in all ten cases for four of the five behaviours, and in nine of ten under timeout, where one crashed-node case did not complete. With one of the four independent validators corrupted, the three honest validators independently meet the 2f + 1 = 3 quorum, so the quorum masks the faulty vote: liveness holds under always-reject and timeout, and safety holds under always-approve and random, where the single corrupted accept never reaches the quorum by itself. These runs corrupt only how a validator votes, which a majority quorum handles; the defining Byzantine case — a primary that equivocates, proposing different fixes to different replicas — is demonstrated separately in Section 6.14, where naive proposal-trust splits the honest replicas while the protocol preserves agreement. The sandbox is retained as a final backstop, catching plausible-but-wrong fixes the validators admit; together with the vote this gives defence in depth.</w:t>
+        <w:t>Consensus formed under every fault behaviour (Table 6): in all ten cases for four of the five behaviours, and in nine of ten under timeout, where one crashed-node case did not complete. With one of the four independent validators corrupted, the three honest validators independently meet the 2f + 1 = 3 quorum, so the quorum masks the faulty vote: liveness holds under always-reject and timeout, and safety holds under always-approve and random, where the single corrupted accept never reaches the quorum by itself. These runs corrupt only how a validator votes, which a majority quorum handles; the defining Byzantine case — a primary that equivocates, proposing different fixes to different replicas — is demonstrated separately in Section 6.14, where naive proposal-</w:t>
+      </w:r>
+      <w:r>
+        <w:lastRenderedPageBreak/>
+        <w:t>trust splits the honest replicas while the protocol preserves agreement. The sandbox is retained as a final backstop, catching plausible-but-wrong fixes the validators admit; together with the vote this gives defence in depth.</w:t>
       </w:r>
     </w:p>
     <w:p>
@@ -6987,9 +6984,8 @@
         <w:rPr>
           <w:noProof/>
         </w:rPr>
-        <w:lastRenderedPageBreak/>
         <w:drawing>
-          <wp:inline distT="0" distB="0" distL="0" distR="0" wp14:anchorId="4968EEC8" wp14:editId="599D46B2">
+          <wp:inline distT="0" distB="0" distL="0" distR="0" wp14:anchorId="1D5BE1B3" wp14:editId="68EE59D4">
             <wp:extent cx="5486400" cy="2969703"/>
             <wp:effectExtent l="0" t="0" r="0" b="0"/>
             <wp:docPr id="5" name="Picture 5"/>
@@ -7043,6 +7039,7 @@
         <w:rPr>
           <w:b/>
         </w:rPr>
+        <w:lastRenderedPageBreak/>
         <w:t>6.7 Diverse-Validator Replication on BugsInPy</w:t>
       </w:r>
     </w:p>
@@ -7409,7 +7406,11 @@
           </w:tcPr>
           <w:p>
             <w:r>
-              <w:t>n = 4 (f = 1, four independent validators, default)</w:t>
+              <w:t xml:space="preserve">n = 4 (f = 1, four </w:t>
+            </w:r>
+            <w:r>
+              <w:lastRenderedPageBreak/>
+              <w:t>independent validators, default)</w:t>
             </w:r>
           </w:p>
         </w:tc>
@@ -7422,6 +7423,7 @@
               <w:cnfStyle w:val="000000100000" w:firstRow="0" w:lastRow="0" w:firstColumn="0" w:lastColumn="0" w:oddVBand="0" w:evenVBand="0" w:oddHBand="1" w:evenHBand="0" w:firstRowFirstColumn="0" w:firstRowLastColumn="0" w:lastRowFirstColumn="0" w:lastRowLastColumn="0"/>
             </w:pPr>
             <w:r>
+              <w:lastRenderedPageBreak/>
               <w:t>30 / 30</w:t>
             </w:r>
           </w:p>
@@ -7609,11 +7611,7 @@
         <w:jc w:val="both"/>
       </w:pPr>
       <w:r>
-        <w:t>The answer to RQ1 is n = 4, f = 1: the minimum PBFT-compliant configuration of four independent validators gives the best repair success and lowest latency, and the fault-injection study confirms it genuinely tolerates one Byzantine voter (Section 6.6). Raising the population to n = 7 (f = 2) buys tolerance to a second Byzantine voter, which the tight-</w:t>
-      </w:r>
-      <w:r>
-        <w:lastRenderedPageBreak/>
-        <w:t>bound study confirms is real (Section 6.13), at higher latency and no repair gain, so n = 4 is the practical optimum for f = 1.</w:t>
+        <w:t>The answer to RQ1 is n = 4, f = 1: the minimum PBFT-compliant configuration of four independent validators gives the best repair success and lowest latency, and the fault-injection study confirms it genuinely tolerates one Byzantine voter (Section 6.6). Raising the population to n = 7 (f = 2) buys tolerance to a second Byzantine voter, which the tight-bound study confirms is real (Section 6.13), at higher latency and no repair gain, so n = 4 is the practical optimum for f = 1.</w:t>
       </w:r>
     </w:p>
     <w:p>
@@ -7892,11 +7890,8 @@
         <w:jc w:val="both"/>
       </w:pPr>
       <w:r>
-        <w:t xml:space="preserve">We ran the pipeline on real Java bugs through the Defects4J benchmark's own checkout, compile and test harness in Docker, against the projects' actual JUnit suites rather than a proxy oracle. The healer emits a minimal search-and-replace edit rather than regenerating the whole file, so the change scales to large classes, and it is shown the failing test; every candidate is then verified against the project's full relevant test suite, so a repair counts only if the suite passes. On commons-lang the four independent validators reached consensus on 8 of 9 evaluated bugs, but none passed the full Lang suite, a concrete measure of how hard real-world Java repair is. On commons-math the pipeline produced two genuine, full-suite-verified repairs, Math-3 (a unanimous 4-of-4 vote) and Math-5 (a 3-of-4 vote, with one validator dissenting on a fix that nevertheless passed the real suite), with consensus reached on all 9 evaluated bugs (Table 10). The real oracle cleanly separates two things the synthetic and snippet-level studies cannot: consensus robustness, which the Byzantine fault-injection matrix proves, and repair capability, which on hard real Java bugs is modest and which we report honestly. Most consensus-approved Java fixes fail the real suite, honest safety violations where the validators accept plausible code the tests reject, which is exactly why the executable suite, not the vote, is the final guarantee of correctness, the same defence in depth seen </w:t>
-      </w:r>
-      <w:r>
         <w:lastRenderedPageBreak/>
-        <w:t>under Byzantine faults. Two points follow: the framework is language-agnostic, since only the sandbox image and run command change; and agreement among validators is necessary but not sufficient on large real classes.</w:t>
+        <w:t>We ran the pipeline on real Java bugs through the Defects4J benchmark's own checkout, compile and test harness in Docker, against the projects' actual JUnit suites rather than a proxy oracle. The healer emits a minimal search-and-replace edit rather than regenerating the whole file, so the change scales to large classes, and it is shown the failing test; every candidate is then verified against the project's full relevant test suite, so a repair counts only if the suite passes. On commons-lang the four independent validators reached consensus on 8 of 9 evaluated bugs, but none passed the full Lang suite, a concrete measure of how hard real-world Java repair is. On commons-math the pipeline produced two genuine, full-suite-verified repairs, Math-3 (a unanimous 4-of-4 vote) and Math-5 (a 3-of-4 vote, with one validator dissenting on a fix that nevertheless passed the real suite), with consensus reached on all 9 evaluated bugs (Table 10). The real oracle cleanly separates two things the synthetic and snippet-level studies cannot: consensus robustness, which the Byzantine fault-injection matrix proves, and repair capability, which on hard real Java bugs is modest and which we report honestly. Most consensus-approved Java fixes fail the real suite, honest safety violations where the validators accept plausible code the tests reject, which is exactly why the executable suite, not the vote, is the final guarantee of correctness, the same defence in depth seen under Byzantine faults. Two points follow: the framework is language-agnostic, since only the sandbox image and run command change; and agreement among validators is necessary but not sufficient on large real classes.</w:t>
       </w:r>
     </w:p>
     <w:p>
@@ -8084,6 +8079,7 @@
         <w:rPr>
           <w:b/>
         </w:rPr>
+        <w:lastRenderedPageBreak/>
         <w:t>6.11 Run-to-Run Variance</w:t>
       </w:r>
     </w:p>
@@ -8114,11 +8110,7 @@
         <w:jc w:val="both"/>
       </w:pPr>
       <w:r>
-        <w:t xml:space="preserve">To answer how latency scales with the agent count (RQ2), we re-ran a five-bug e-commerce subset at n = 4 (f = 1), n = 7 (f = 2) and n = 10 (f = 3). Median proposal-to-decision latency rose from 53.3 s at n = 4 to 71.3 s at n = 7 and 80.1 s at n = 10, and the 99th percentile grew faster, from 59.6 s to 78.0 s to 168.6 s, because each added validator is another concurrent CPU-bound Ollama call and the round waits for the slowest. This five-bug subset is sized to measure latency, not repair quality: it is far too small to </w:t>
-      </w:r>
-      <w:r>
-        <w:lastRenderedPageBreak/>
-        <w:t>distinguish, say, 90% from 100% success, so we draw no success or safety conclusion from it. The cost-benefit case for n = 4 — that n = 7 lowers success with no safety gain — rests on the 30-bug comparison of Section 6.8, not on this sweep. The PBFT protocol itself stays under 2 ms per round; the growth is validator inference, not consensus. Latency under the five Byzantine scenarios was comparable to the fault-free case, because the quorum still forms from the honest agents and the round does not wait on the corrupted one; continuous-fault recovery timing is left to future work (Section 8.2). These answers to RQ1 and RQ2 come from a single dataset and a small per-configuration sample, so we read them as indicative rather than definitive.</w:t>
+        <w:t>To answer how latency scales with the agent count (RQ2), we re-ran a five-bug e-commerce subset at n = 4 (f = 1), n = 7 (f = 2) and n = 10 (f = 3). Median proposal-to-decision latency rose from 53.3 s at n = 4 to 71.3 s at n = 7 and 80.1 s at n = 10, and the 99th percentile grew faster, from 59.6 s to 78.0 s to 168.6 s, because each added validator is another concurrent CPU-bound Ollama call and the round waits for the slowest. This five-bug subset is sized to measure latency, not repair quality: it is far too small to distinguish, say, 90% from 100% success, so we draw no success or safety conclusion from it. The cost-benefit case for n = 4 — that n = 7 lowers success with no safety gain — rests on the 30-bug comparison of Section 6.8, not on this sweep. The PBFT protocol itself stays under 2 ms per round; the growth is validator inference, not consensus. Latency under the five Byzantine scenarios was comparable to the fault-free case, because the quorum still forms from the honest agents and the round does not wait on the corrupted one; continuous-fault recovery timing is left to future work (Section 8.2). These answers to RQ1 and RQ2 come from a single dataset and a small per-configuration sample, so we read them as indicative rather than definitive.</w:t>
       </w:r>
     </w:p>
     <w:p>
@@ -8350,7 +8342,11 @@
         <w:jc w:val="both"/>
       </w:pPr>
       <w:r>
-        <w:t>To show the f = 1 result is not a ceiling and that the tolerance bound is exact, we re-ran the e-commerce set at f = 2 (n = 3f + 1 = 7, quorum = 2f + 1 = 5) with seven independent voters and injected an increasing number of Byzantine rejecters. With no fault all seven vote and consensus forms; with two faults (= f) five honest validators still meet the quorum and consensus forms; with three faults (= f + 1) only four honest validators remain, below the quorum of five, and consensus provably cannot form in any case. Prepare votes fall 7, then 5, then 4 as faults rise 0, 2, 3 (Table 12, Figure 6). The quorum therefore tolerates exactly f faulty votes and no more; the safety of the protocol under a genuinely Byzantine (equivocating) primary, the case majority voting cannot handle, is demonstrated next in Section 6.14.</w:t>
+        <w:t xml:space="preserve">To show the f = 1 result is not a ceiling and that the tolerance bound is exact, we re-ran the e-commerce set at f = 2 (n = 3f + 1 = 7, quorum = 2f + 1 = 5) with seven independent voters and injected an increasing number of Byzantine rejecters. With no fault all seven vote and consensus forms; with two faults (= f) five honest validators still meet the quorum and consensus forms; with three faults (= f + 1) only four honest validators remain, below the quorum of five, and consensus provably cannot form in any case. </w:t>
+      </w:r>
+      <w:r>
+        <w:lastRenderedPageBreak/>
+        <w:t>Prepare votes fall 7, then 5, then 4 as faults rise 0, 2, 3 (Table 12, Figure 6). The quorum therefore tolerates exactly f faulty votes and no more; the safety of the protocol under a genuinely Byzantine (equivocating) primary, the case majority voting cannot handle, is demonstrated next in Section 6.14.</w:t>
       </w:r>
     </w:p>
     <w:p>
@@ -8721,9 +8717,8 @@
         <w:rPr>
           <w:noProof/>
         </w:rPr>
-        <w:lastRenderedPageBreak/>
         <w:drawing>
-          <wp:inline distT="0" distB="0" distL="0" distR="0" wp14:anchorId="01AE04EB" wp14:editId="0BFF4E37">
+          <wp:inline distT="0" distB="0" distL="0" distR="0" wp14:anchorId="1AF91700" wp14:editId="60F40D93">
             <wp:extent cx="5029200" cy="3335154"/>
             <wp:effectExtent l="0" t="0" r="0" b="0"/>
             <wp:docPr id="70320688" name="Picture 70320688"/>
@@ -8786,7 +8781,11 @@
         <w:jc w:val="both"/>
       </w:pPr>
       <w:r>
-        <w:t>The fault-injection runs above (Sections 6.6, 6.13) corrupt how a validator votes, which a majority quorum masks; they do not exercise the failure the Byzantine Generals problem is named for, a participant that lies inconsistently, telling different things to different peers. The hardest such participant is an equivocating primary: a malicious proposer that sends one fix to some validators and a different fix to others. To test this directly we built an independent-replica realisation of the protocol in which four replicas exchange Ed25519-signed pre-prepare, prepare and commit messages over a network that can delay, drop and partition them, and compared it with a naive proposal-trust scheme that commits whatever proposal it receives. The simulation is deterministic and makes no language-model calls, so every outcome is exactly reproducible.</w:t>
+        <w:t xml:space="preserve">The fault-injection runs above (Sections 6.6, 6.13) corrupt how a validator votes, which a majority quorum masks; they do not exercise the failure the Byzantine Generals problem is named for, a participant that lies inconsistently, telling different things to different </w:t>
+      </w:r>
+      <w:r>
+        <w:lastRenderedPageBreak/>
+        <w:t>peers. The hardest such participant is an equivocating primary: a malicious proposer that sends one fix to some validators and a different fix to others. To test this directly we built an independent-replica realisation of the protocol in which four replicas exchange Ed25519-signed pre-prepare, prepare and commit messages over a network that can delay, drop and partition them, and compared it with a naive proposal-trust scheme that commits whatever proposal it receives. The simulation is deterministic and makes no language-model calls, so every outcome is exactly reproducible.</w:t>
       </w:r>
     </w:p>
     <w:p>
@@ -8795,11 +8794,7 @@
         <w:jc w:val="both"/>
       </w:pPr>
       <w:r>
-        <w:t xml:space="preserve">Table 13 reports eight scenarios under both schemes. Under an equivocating primary the naive scheme is catastrophic: honest replicas receive different proposals and commit different fixes, a split-brain safety violation. The protocol prevents this — committing requires a 2f + 1 quorum certificate on a single digest, and any two such quorums share an honest replica that will not certify two different digests for the same slot, so no two honest replicas ever commit different fixes (Figure 7). It correctly makes no progress in that case until a new primary is elected, which is the role of view-change (Section 8). The other scenarios confirm the design: a single equivocating validator and forged messages are rejected — a replica cannot impersonate another, so one Byzantine node cannot </w:t>
-      </w:r>
-      <w:r>
-        <w:lastRenderedPageBreak/>
-        <w:t>manufacture a quorum; f = 1 crash is tolerated while f + 1 = 2 is not; and a network partition blocks progress without ever causing a split, with progress resuming once the partition heals.</w:t>
+        <w:t>Table 13 reports eight scenarios under both schemes. Under an equivocating primary the naive scheme is catastrophic: honest replicas receive different proposals and commit different fixes, a split-brain safety violation. The protocol prevents this — committing requires a 2f + 1 quorum certificate on a single digest, and any two such quorums share an honest replica that will not certify two different digests for the same slot, so no two honest replicas ever commit different fixes (Figure 7). It correctly makes no progress in that case until a new primary is elected, which is the role of view-change (Section 8). The other scenarios confirm the design: a single equivocating validator and forged messages are rejected — a replica cannot impersonate another, so one Byzantine node cannot manufacture a quorum; f = 1 crash is tolerated while f + 1 = 2 is not; and a network partition blocks progress without ever causing a split, with progress resuming once the partition heals.</w:t>
       </w:r>
     </w:p>
     <w:p>
@@ -9112,6 +9107,7 @@
           </w:tcPr>
           <w:p>
             <w:r>
+              <w:lastRenderedPageBreak/>
               <w:t>Malicious primary EQUIVOCATES</w:t>
             </w:r>
           </w:p>
@@ -9148,7 +9144,7 @@
           <w:noProof/>
         </w:rPr>
         <w:drawing>
-          <wp:inline distT="0" distB="0" distL="0" distR="0" wp14:anchorId="5C685937" wp14:editId="2A337D85">
+          <wp:inline distT="0" distB="0" distL="0" distR="0" wp14:anchorId="0DB9B18C" wp14:editId="27DD05FA">
             <wp:extent cx="5669280" cy="3290406"/>
             <wp:effectExtent l="0" t="0" r="0" b="0"/>
             <wp:docPr id="70320689" name="Picture 70320689"/>
@@ -9190,7 +9186,6 @@
         <w:jc w:val="both"/>
       </w:pPr>
       <w:r>
-        <w:lastRenderedPageBreak/>
         <w:t>Figure 7. Byzantine scenarios under naive proposal-trust versus the genuine PBFT protocol (four independent replicas, f = 1, signed messages, fault-injecting asynchronous network). Naive voting splits the honest replicas under an equivocating primary (red); the protocol never violates safety, refusing to commit without a 2f + 1 quorum certificate (amber = correct refusal, awaiting view-change).</w:t>
       </w:r>
     </w:p>
@@ -9234,7 +9229,11 @@
         <w:jc w:val="both"/>
       </w:pPr>
       <w:r>
-        <w:t>There is also a clear cost story: consensus is roughly three times slower per repair, almost entirely from validator latency. Where each repair is a high-stakes commit such as production payment logic, trading tens of seconds (about 30 s on e-commerce, more on hard real bugs) for fewer unsafe fixes is defensible; where speed dominates, it may not be. The synthetic benchmark, perfect in both modes, is a sanity check.</w:t>
+        <w:t xml:space="preserve">There is also a clear cost story: consensus is roughly three times slower per repair, almost entirely from validator latency. Where each repair is a high-stakes commit such as </w:t>
+      </w:r>
+      <w:r>
+        <w:lastRenderedPageBreak/>
+        <w:t>production payment logic, trading tens of seconds (about 30 s on e-commerce, more on hard real bugs) for fewer unsafe fixes is defensible; where speed dominates, it may not be. The synthetic benchmark, perfect in both modes, is a sanity check.</w:t>
       </w:r>
     </w:p>
     <w:p>
@@ -9264,11 +9263,7 @@
         <w:jc w:val="both"/>
       </w:pPr>
       <w:r>
-        <w:t xml:space="preserve">On the easy synthetic bugs the four validators agree in near-lockstep (mean pairwise agreement close to 1.0), which leaves little diversity signal there. The heterogeneous cross-provider panel does decorrelate on harder inputs, however: mean pairwise </w:t>
-      </w:r>
-      <w:r>
-        <w:lastRenderedPageBreak/>
-        <w:t>agreement falls to 0.925 on the real BugsInPy bugs, with three genuine split votes in which Claude-Haiku dissented while the other three validators approved.</w:t>
+        <w:t>On the easy synthetic bugs the four validators agree in near-lockstep (mean pairwise agreement close to 1.0), which leaves little diversity signal there. The heterogeneous cross-provider panel does decorrelate on harder inputs, however: mean pairwise agreement falls to 0.925 on the real BugsInPy bugs, with three genuine split votes in which Claude-Haiku dissented while the other three validators approved.</w:t>
       </w:r>
     </w:p>
     <w:p>
@@ -9325,6 +9320,7 @@
         <w:ind w:left="360" w:hanging="360"/>
       </w:pPr>
       <w:r>
+        <w:lastRenderedPageBreak/>
         <w:t>External validity. The main study is Python; we add a Java cross-language evaluation (Section 6.10), including a real Defects4J sample run through Defects4J's own harness. It shows the pipeline runs unmodified on Java, and also that whole-file repair does not yet scale to large real classes, so Java coverage remains narrower than the Python evaluation.</w:t>
       </w:r>
     </w:p>
@@ -9361,7 +9357,6 @@
         <w:rPr>
           <w:b/>
         </w:rPr>
-        <w:lastRenderedPageBreak/>
         <w:t>7.4 Direct Answers to the Project Proposal's Research Questions</w:t>
       </w:r>
     </w:p>
@@ -9398,7 +9393,11 @@
         <w:jc w:val="both"/>
       </w:pPr>
       <w:r>
-        <w:t>RQ3. Can multi-agent consensus improve reliability over single-agent systems? Yes. On the BugsInPy subset consensus directionally reduced the safety-violation rate (75% to 50%) and, contrary to a recall-for-precision trade-off, also raised the repair rate (25% to 50%), because the four independent validators reject overconfident fixes the single agent commits while the sandbox admits the genuine ones. Neither paired difference reaches significance at this sample size, so the paper's strongest reliability result is the deterministic Byzantine-tolerance guarantee (Sections 6.6 and 6.13), with the paired repair and safety gains reported as directional.</w:t>
+        <w:t xml:space="preserve">RQ3. Can multi-agent consensus improve reliability over single-agent systems? Yes. On the BugsInPy subset consensus directionally reduced the safety-violation rate (75% to 50%) and, contrary to a recall-for-precision trade-off, also raised the repair rate (25% to 50%), because the four independent validators reject overconfident fixes the single agent commits while the sandbox admits the genuine ones. Neither paired difference reaches </w:t>
+      </w:r>
+      <w:r>
+        <w:lastRenderedPageBreak/>
+        <w:t>significance at this sample size, so the paper's strongest reliability result is the deterministic Byzantine-tolerance guarantee (Sections 6.6 and 6.13), with the paired repair and safety gains reported as directional.</w:t>
       </w:r>
     </w:p>
     <w:p>
@@ -9407,7 +9406,7 @@
         <w:jc w:val="both"/>
       </w:pPr>
       <w:r>
-        <w:t>RQ4 (exploratory). What economic benefit can e-commerce businesses derive from reduced downtime? Industry reports place the cost of critical software downtime in the range of hundreds of thousands to over a million US dollars per hour (CISQ, 2022). Taking an illustrative US$1 million per hour and a 30-minute recovery, the directional reduction in unsafe fixes (about 6 percentage points across the corpus, 16.7% to 11.1%) would avoid on the order of US$3 million per 100 high-stakes repairs, against an API cost of a few dollars each. We treat this as an order-of-magnitude estimate, not a measured outcome; a live-deployment economic study (objective O3) is future work.</w:t>
+        <w:t>RQ4 (exploratory). What economic benefit can e-commerce businesses derive from reduced downtime? Industry reports place critical-downtime cost in the hundreds of thousands to over a million US dollars per hour (CISQ, 2022); Section 7.5 develops an order-of-magnitude estimate from our directional safety reduction. We treat it as indicative, not a measured outcome; a live-deployment economic study (objective O3) is future work.</w:t>
       </w:r>
     </w:p>
     <w:p>
@@ -9428,11 +9427,7 @@
         <w:jc w:val="both"/>
       </w:pPr>
       <w:r>
-        <w:t xml:space="preserve">For an e-commerce team the practical gain is fewer false-positive fixes, a directional reduction of about 6 percentage points across the full corpus (16.7% to 11.1%, and 75% to 50% on the hardest real-world subset), and, more importantly, a guarantee that no </w:t>
-      </w:r>
-      <w:r>
-        <w:lastRenderedPageBreak/>
-        <w:t>consensus-approved fix is applied until it clears an executable sandbox and that the consensus itself tolerates up to f Byzantine validators. Per 100 high-stakes repairs a 6-point reduction is about 6 averted incidents; at a commonly cited cost near US$1 million per hour of critical downtime and a 30-minute recovery, on the order of US$3 million in avoided loss per 100 repairs, against an API cost of a few dollars each (consistent with Section 7.4). The broader point is trust: systems that occasionally commit unsafe changes erode confidence in AI-assisted infrastructure, and auditable, fault-tolerant automation in payment, inventory and refund systems is a step toward addressing that.</w:t>
+        <w:t>For an e-commerce team the practical gain is fewer false-positive fixes — a directional reduction of about 6 percentage points across the corpus (16.7% to 11.1%) — and, more importantly, a guarantee that no consensus-approved fix is applied until it clears an executable sandbox, with consensus that tolerates up to f Byzantine validators. As an order-of-magnitude estimate, per 100 high-stakes repairs that is roughly 6 averted incidents, worth on the order of US$3 million at commonly cited downtime costs against an API cost of a few dollars each (Section 7.4). The broader point is trust: auditable, fault-tolerant automation in payment, inventory and refund systems is a step toward the confidence such infrastructure needs.</w:t>
       </w:r>
     </w:p>
     <w:p>
@@ -9487,6 +9482,7 @@
         <w:rPr>
           <w:b/>
         </w:rPr>
+        <w:lastRenderedPageBreak/>
         <w:t>8.2 Recovery time under continuous fault streams</w:t>
       </w:r>
     </w:p>
@@ -9517,11 +9513,7 @@
         <w:jc w:val="both"/>
       </w:pPr>
       <w:r>
-        <w:t xml:space="preserve">We report a Defects4J sample in Section 6.10, run inside a Docker image that resolves the Java, Perl and Maven prerequisites that block Defects4J on Windows, with a search-and-replace healer that already scales to large classes. Scaling to the full benchmark is the next step; the main lever for a higher repair rate is stronger fault localisation so the </w:t>
-      </w:r>
-      <w:r>
-        <w:lastRenderedPageBreak/>
-        <w:t>healer edits the right region, together with validators carrying language-specific static checks, which are currently Python-tuned.</w:t>
+        <w:t>We report a Defects4J sample in Section 6.10, run inside a Docker image that resolves the Java, Perl and Maven prerequisites that block Defects4J on Windows, with a search-and-replace healer that already scales to large classes. Scaling to the full benchmark is the next step; the main lever for a higher repair rate is stronger fault localisation so the healer edits the right region, together with validators carrying language-specific static checks, which are currently Python-tuned.</w:t>
       </w:r>
     </w:p>
     <w:p>
@@ -9585,7 +9577,11 @@
         <w:spacing w:before="240" w:after="120"/>
       </w:pPr>
       <w:r>
-        <w:t>This study began with a scientific problem: classical Byzantine fault tolerance assumes deterministic replicas, yet LLM agents are stochastic, so the usual rule that disagreement signals a fault no longer holds. Our aim was to test empirically whether PBFT, adapted to heterogeneous LLM agents and backed by an executable sandbox, can remove unsafe automated fixes. The answer is yes for safety, at a measurable latency cost, and we show that a semantic-equivalence rule is what lets such agents reach agreement at all.</w:t>
+        <w:t xml:space="preserve">This study began with a scientific problem: classical Byzantine fault tolerance assumes deterministic replicas, yet LLM agents are stochastic, so the usual rule that disagreement signals a fault no longer holds. Our aim was to test empirically whether PBFT, adapted to heterogeneous LLM agents and backed by an executable sandbox, can remove unsafe automated fixes. The answer is yes for safety, at a measurable </w:t>
+      </w:r>
+      <w:r>
+        <w:lastRenderedPageBreak/>
+        <w:t>latency cost, and we show that a semantic-equivalence rule is what lets such agents reach agreement at all.</w:t>
       </w:r>
     </w:p>
     <w:p>
@@ -9603,11 +9599,7 @@
         <w:jc w:val="both"/>
       </w:pPr>
       <w:r>
-        <w:t xml:space="preserve">This paper demonstrates the Byzantine fault tolerance of the consensus layer directly (Section 6.14) and compares the exact and semantic quorum rules (Section 6.9), across a synthetic benchmark, a BugsInPy subset, a custom e-commerce suite and a </w:t>
-      </w:r>
-      <w:r>
-        <w:lastRenderedPageBreak/>
-        <w:t>Java/Defects4J sample, against a single-agent baseline sharing the same analyzer and healer. The heterogeneous-population decorrelation is a measured negative result; reputation-weighted voting and the knowledge-graph layer remain implemented but unevaluated.</w:t>
+        <w:t>This paper demonstrates the Byzantine fault tolerance of the consensus layer directly (Section 6.14) and compares the exact and semantic quorum rules (Section 6.9), across a synthetic benchmark, a BugsInPy subset, a custom e-commerce suite and a Java/Defects4J sample, against a single-agent baseline sharing the same analyzer and healer. The heterogeneous-population decorrelation is a measured negative result; reputation-weighted voting and the knowledge-graph layer remain implemented but unevaluated.</w:t>
       </w:r>
     </w:p>
     <w:p>
@@ -9656,7 +9648,11 @@
         <w:jc w:val="both"/>
       </w:pPr>
       <w:r>
-        <w:t>Abraham, I., Dolev, D., &amp; Halpern, J. Y. (2008). An almost-surely terminating polynomial protocol for asynchronous Byzantine agreement with optimal resilience. In Proceedings of the 27th ACM Symposium on Principles of Distributed Computing (PODC) (pp. 258–267). ACM. https://doi.org/10.1145/1400751.1400804</w:t>
+        <w:t xml:space="preserve">Abraham, I., Dolev, D., &amp; Halpern, J. Y. (2008). An almost-surely terminating polynomial protocol for asynchronous Byzantine agreement with optimal resilience. In Proceedings </w:t>
+      </w:r>
+      <w:r>
+        <w:lastRenderedPageBreak/>
+        <w:t>of the 27th ACM Symposium on Principles of Distributed Computing (PODC) (pp. 258–267). ACM. https://doi.org/10.1145/1400751.1400804</w:t>
       </w:r>
     </w:p>
     <w:p>
@@ -9719,7 +9715,6 @@
         <w:jc w:val="both"/>
       </w:pPr>
       <w:r>
-        <w:lastRenderedPageBreak/>
         <w:t>Blanchard, P., El Mhamdi, E. M., Guerraoui, R., &amp; Stainer, J. (2017). Machine learning with adversaries: Byzantine tolerant gradient descent. In Advances in Neural Information Processing Systems (NeurIPS) 30 (2017) (pp. 119–129). Curran Associates.</w:t>
       </w:r>
     </w:p>
@@ -9837,6 +9832,7 @@
         <w:jc w:val="both"/>
       </w:pPr>
       <w:r>
+        <w:lastRenderedPageBreak/>
         <w:t xml:space="preserve">Dwork, C., Lynch, N., &amp; Stockmeyer, L. (1988). Consensus in the presence of partial synchrony. </w:t>
       </w:r>
       <w:r>
@@ -9900,7 +9896,6 @@
         <w:jc w:val="both"/>
       </w:pPr>
       <w:r>
-        <w:lastRenderedPageBreak/>
         <w:t xml:space="preserve">Gupta, R., Pal, S., Kanade, A., &amp; Shevade, S. (2017). DeepFix: Fixing common C language errors by deep learning. In </w:t>
       </w:r>
       <w:r>
@@ -10033,7 +10028,14 @@
         <w:rPr>
           <w:i/>
         </w:rPr>
-        <w:t>Proceedings of the 41st International Conference on Software Engineering: Software Engineering in Practice (ICSE-SEIP)</w:t>
+        <w:t xml:space="preserve">Proceedings of the 41st International </w:t>
+      </w:r>
+      <w:r>
+        <w:rPr>
+          <w:i/>
+        </w:rPr>
+        <w:lastRenderedPageBreak/>
+        <w:t>Conference on Software Engineering: Software Engineering in Practice (ICSE-SEIP)</w:t>
       </w:r>
       <w:r>
         <w:t xml:space="preserve"> (pp. 269–278). IEEE. https://doi.org/10.1109/ICSE-SEIP.2019.00039</w:t>
@@ -10078,14 +10080,7 @@
         <w:rPr>
           <w:i/>
         </w:rPr>
-        <w:t xml:space="preserve">Proceedings of the ACM SIGSAC Conference on Computer and </w:t>
-      </w:r>
-      <w:r>
-        <w:rPr>
-          <w:i/>
-        </w:rPr>
-        <w:lastRenderedPageBreak/>
-        <w:t>Communications Security (CCS)</w:t>
+        <w:t>Proceedings of the ACM SIGSAC Conference on Computer and Communications Security (CCS)</w:t>
       </w:r>
       <w:r>
         <w:t xml:space="preserve"> (pp. 31–42). ACM. https://doi.org/10.1145/2976749.2978399</w:t>
@@ -10196,6 +10191,7 @@
         <w:jc w:val="both"/>
       </w:pPr>
       <w:r>
+        <w:lastRenderedPageBreak/>
         <w:t xml:space="preserve">Widyasari, R., Sim, S. Q., Lok, C., Qi, H., Phan, J., Tay, Q., et al. (2020). BugsInPy: A database of existing bugs in Python programs to enable controlled testing and debugging studies. In </w:t>
       </w:r>
       <w:r>
@@ -10250,7 +10246,6 @@
         <w:jc w:val="both"/>
       </w:pPr>
       <w:r>
-        <w:lastRenderedPageBreak/>
         <w:t xml:space="preserve">Yao, S., Zhao, J., Yu, D., Du, N., Shafran, I., Narasimhan, K., &amp; Cao, Y. (2023). ReAct: Synergizing reasoning and acting in language models. In </w:t>
       </w:r>
       <w:r>
@@ -13412,7 +13407,7 @@
       <mc:AlternateContent>
         <mc:Choice Requires="wps">
           <w:drawing>
-            <wp:anchor distT="0" distB="0" distL="0" distR="0" simplePos="0" relativeHeight="251659264" behindDoc="0" locked="0" layoutInCell="1" allowOverlap="1" wp14:anchorId="026AC27E" wp14:editId="19983CEE">
+            <wp:anchor distT="0" distB="0" distL="0" distR="0" simplePos="0" relativeHeight="251659264" behindDoc="0" locked="0" layoutInCell="1" allowOverlap="1" wp14:anchorId="00CF776B" wp14:editId="2B561AA8">
               <wp:simplePos x="635" y="635"/>
               <wp:positionH relativeFrom="page">
                 <wp:align>right</wp:align>
@@ -13423,7 +13418,7 @@
               <wp:extent cx="1482090" cy="370205"/>
               <wp:effectExtent l="0" t="0" r="0" b="10795"/>
               <wp:wrapNone/>
-              <wp:docPr id="1939457796" name="Text Box 2" descr="FBCH_CONFIDENTIAL">
+              <wp:docPr id="285593758" name="Text Box 2" descr="FBCH_CONFIDENTIAL">
                 <a:extLst xmlns:a="http://schemas.openxmlformats.org/drawingml/2006/main">
                   <a:ext uri="{5AE41FA2-C0FF-4470-9BD4-5FADCA87CBE2}">
                     <aclsh:classification xmlns:aclsh="http://schemas.microsoft.com/office/drawing/2020/classificationShape" classificationOutcomeType="hdr"/>
@@ -13488,7 +13483,7 @@
         </mc:Choice>
         <mc:Fallback>
           <w:pict>
-            <v:shapetype w14:anchorId="026AC27E" id="_x0000_t202" coordsize="21600,21600" o:spt="202" path="m,l,21600r21600,l21600,xe">
+            <v:shapetype w14:anchorId="00CF776B" id="_x0000_t202" coordsize="21600,21600" o:spt="202" path="m,l,21600r21600,l21600,xe">
               <v:stroke joinstyle="miter"/>
               <v:path gradientshapeok="t" o:connecttype="rect"/>
             </v:shapetype>
@@ -13544,7 +13539,7 @@
       <mc:AlternateContent>
         <mc:Choice Requires="wps">
           <w:drawing>
-            <wp:anchor distT="0" distB="0" distL="0" distR="0" simplePos="0" relativeHeight="251660288" behindDoc="0" locked="0" layoutInCell="1" allowOverlap="1" wp14:anchorId="423E6CA4" wp14:editId="38B05845">
+            <wp:anchor distT="0" distB="0" distL="0" distR="0" simplePos="0" relativeHeight="251660288" behindDoc="0" locked="0" layoutInCell="1" allowOverlap="1" wp14:anchorId="36BEBFC1" wp14:editId="78F1D87F">
               <wp:simplePos x="635" y="635"/>
               <wp:positionH relativeFrom="page">
                 <wp:align>right</wp:align>
@@ -13555,7 +13550,7 @@
               <wp:extent cx="1482090" cy="370205"/>
               <wp:effectExtent l="0" t="0" r="0" b="10795"/>
               <wp:wrapNone/>
-              <wp:docPr id="610716097" name="Text Box 3" descr="FBCH_CONFIDENTIAL">
+              <wp:docPr id="1827277670" name="Text Box 3" descr="FBCH_CONFIDENTIAL">
                 <a:extLst xmlns:a="http://schemas.openxmlformats.org/drawingml/2006/main">
                   <a:ext uri="{5AE41FA2-C0FF-4470-9BD4-5FADCA87CBE2}">
                     <aclsh:classification xmlns:aclsh="http://schemas.microsoft.com/office/drawing/2020/classificationShape" classificationOutcomeType="hdr"/>
@@ -13620,7 +13615,7 @@
         </mc:Choice>
         <mc:Fallback>
           <w:pict>
-            <v:shapetype w14:anchorId="423E6CA4" id="_x0000_t202" coordsize="21600,21600" o:spt="202" path="m,l,21600r21600,l21600,xe">
+            <v:shapetype w14:anchorId="36BEBFC1" id="_x0000_t202" coordsize="21600,21600" o:spt="202" path="m,l,21600r21600,l21600,xe">
               <v:stroke joinstyle="miter"/>
               <v:path gradientshapeok="t" o:connecttype="rect"/>
             </v:shapetype>
@@ -13676,7 +13671,7 @@
       <mc:AlternateContent>
         <mc:Choice Requires="wps">
           <w:drawing>
-            <wp:anchor distT="0" distB="0" distL="0" distR="0" simplePos="0" relativeHeight="251658240" behindDoc="0" locked="0" layoutInCell="1" allowOverlap="1" wp14:anchorId="5259F844" wp14:editId="36EC1FB2">
+            <wp:anchor distT="0" distB="0" distL="0" distR="0" simplePos="0" relativeHeight="251658240" behindDoc="0" locked="0" layoutInCell="1" allowOverlap="1" wp14:anchorId="250EE1BF" wp14:editId="2073C06C">
               <wp:simplePos x="635" y="635"/>
               <wp:positionH relativeFrom="page">
                 <wp:align>right</wp:align>
@@ -13687,7 +13682,7 @@
               <wp:extent cx="1482090" cy="370205"/>
               <wp:effectExtent l="0" t="0" r="0" b="10795"/>
               <wp:wrapNone/>
-              <wp:docPr id="1209995654" name="Text Box 1" descr="FBCH_CONFIDENTIAL">
+              <wp:docPr id="399970267" name="Text Box 1" descr="FBCH_CONFIDENTIAL">
                 <a:extLst xmlns:a="http://schemas.openxmlformats.org/drawingml/2006/main">
                   <a:ext uri="{5AE41FA2-C0FF-4470-9BD4-5FADCA87CBE2}">
                     <aclsh:classification xmlns:aclsh="http://schemas.microsoft.com/office/drawing/2020/classificationShape" classificationOutcomeType="hdr"/>
@@ -13752,7 +13747,7 @@
         </mc:Choice>
         <mc:Fallback>
           <w:pict>
-            <v:shapetype w14:anchorId="5259F844" id="_x0000_t202" coordsize="21600,21600" o:spt="202" path="m,l,21600r21600,l21600,xe">
+            <v:shapetype w14:anchorId="250EE1BF" id="_x0000_t202" coordsize="21600,21600" o:spt="202" path="m,l,21600r21600,l21600,xe">
               <v:stroke joinstyle="miter"/>
               <v:path gradientshapeok="t" o:connecttype="rect"/>
             </v:shapetype>
@@ -13931,7 +13926,7 @@
   <w:abstractNum w:abstractNumId="7" w15:restartNumberingAfterBreak="0">
     <w:nsid w:val="FFFFFF88"/>
     <w:multiLevelType w:val="singleLevel"/>
-    <w:tmpl w:val="8102C170"/>
+    <w:tmpl w:val="62C491E0"/>
     <w:lvl w:ilvl="0">
       <w:start w:val="1"/>
       <w:numFmt w:val="decimal"/>
@@ -13949,7 +13944,7 @@
   <w:abstractNum w:abstractNumId="8" w15:restartNumberingAfterBreak="0">
     <w:nsid w:val="FFFFFF89"/>
     <w:multiLevelType w:val="singleLevel"/>
-    <w:tmpl w:val="28C6778A"/>
+    <w:tmpl w:val="CA744C38"/>
     <w:lvl w:ilvl="0">
       <w:start w:val="1"/>
       <w:numFmt w:val="bullet"/>
@@ -14405,7 +14400,7 @@
     <w:link w:val="Heading1Char"/>
     <w:uiPriority w:val="9"/>
     <w:qFormat/>
-    <w:rsid w:val="00DC64AF"/>
+    <w:rsid w:val="00923657"/>
     <w:pPr>
       <w:keepNext/>
       <w:keepLines/>
@@ -14427,7 +14422,7 @@
     <w:uiPriority w:val="9"/>
     <w:unhideWhenUsed/>
     <w:qFormat/>
-    <w:rsid w:val="00DC64AF"/>
+    <w:rsid w:val="00923657"/>
     <w:pPr>
       <w:keepNext/>
       <w:keepLines/>
@@ -14449,7 +14444,7 @@
     <w:uiPriority w:val="9"/>
     <w:unhideWhenUsed/>
     <w:qFormat/>
-    <w:rsid w:val="00DC64AF"/>
+    <w:rsid w:val="00923657"/>
     <w:pPr>
       <w:keepNext/>
       <w:keepLines/>
@@ -14472,7 +14467,7 @@
     <w:semiHidden/>
     <w:unhideWhenUsed/>
     <w:qFormat/>
-    <w:rsid w:val="00DC64AF"/>
+    <w:rsid w:val="00923657"/>
     <w:pPr>
       <w:keepNext/>
       <w:keepLines/>
@@ -14495,7 +14490,7 @@
     <w:semiHidden/>
     <w:unhideWhenUsed/>
     <w:qFormat/>
-    <w:rsid w:val="00DC64AF"/>
+    <w:rsid w:val="00923657"/>
     <w:pPr>
       <w:keepNext/>
       <w:keepLines/>
@@ -14516,7 +14511,7 @@
     <w:semiHidden/>
     <w:unhideWhenUsed/>
     <w:qFormat/>
-    <w:rsid w:val="00DC64AF"/>
+    <w:rsid w:val="00923657"/>
     <w:pPr>
       <w:keepNext/>
       <w:keepLines/>
@@ -14539,7 +14534,7 @@
     <w:semiHidden/>
     <w:unhideWhenUsed/>
     <w:qFormat/>
-    <w:rsid w:val="00DC64AF"/>
+    <w:rsid w:val="00923657"/>
     <w:pPr>
       <w:keepNext/>
       <w:keepLines/>
@@ -14560,7 +14555,7 @@
     <w:semiHidden/>
     <w:unhideWhenUsed/>
     <w:qFormat/>
-    <w:rsid w:val="00DC64AF"/>
+    <w:rsid w:val="00923657"/>
     <w:pPr>
       <w:keepNext/>
       <w:keepLines/>
@@ -14583,7 +14578,7 @@
     <w:semiHidden/>
     <w:unhideWhenUsed/>
     <w:qFormat/>
-    <w:rsid w:val="00DC64AF"/>
+    <w:rsid w:val="00923657"/>
     <w:pPr>
       <w:keepNext/>
       <w:keepLines/>
@@ -14627,7 +14622,7 @@
     <w:basedOn w:val="DefaultParagraphFont"/>
     <w:link w:val="Heading1"/>
     <w:uiPriority w:val="9"/>
-    <w:rsid w:val="00DC64AF"/>
+    <w:rsid w:val="00923657"/>
     <w:rPr>
       <w:rFonts w:asciiTheme="majorHAnsi" w:eastAsiaTheme="majorEastAsia" w:hAnsiTheme="majorHAnsi" w:cstheme="majorBidi"/>
       <w:color w:val="0F4761" w:themeColor="accent1" w:themeShade="BF"/>
@@ -14640,7 +14635,7 @@
     <w:basedOn w:val="DefaultParagraphFont"/>
     <w:link w:val="Heading2"/>
     <w:uiPriority w:val="9"/>
-    <w:rsid w:val="00DC64AF"/>
+    <w:rsid w:val="00923657"/>
     <w:rPr>
       <w:rFonts w:asciiTheme="majorHAnsi" w:eastAsiaTheme="majorEastAsia" w:hAnsiTheme="majorHAnsi" w:cstheme="majorBidi"/>
       <w:color w:val="0F4761" w:themeColor="accent1" w:themeShade="BF"/>
@@ -14653,7 +14648,7 @@
     <w:basedOn w:val="DefaultParagraphFont"/>
     <w:link w:val="Heading3"/>
     <w:uiPriority w:val="9"/>
-    <w:rsid w:val="00DC64AF"/>
+    <w:rsid w:val="00923657"/>
     <w:rPr>
       <w:rFonts w:eastAsiaTheme="majorEastAsia" w:cstheme="majorBidi"/>
       <w:color w:val="0F4761" w:themeColor="accent1" w:themeShade="BF"/>
@@ -14667,7 +14662,7 @@
     <w:link w:val="Heading4"/>
     <w:uiPriority w:val="9"/>
     <w:semiHidden/>
-    <w:rsid w:val="00DC64AF"/>
+    <w:rsid w:val="00923657"/>
     <w:rPr>
       <w:rFonts w:eastAsiaTheme="majorEastAsia" w:cstheme="majorBidi"/>
       <w:i/>
@@ -14681,7 +14676,7 @@
     <w:link w:val="Heading5"/>
     <w:uiPriority w:val="9"/>
     <w:semiHidden/>
-    <w:rsid w:val="00DC64AF"/>
+    <w:rsid w:val="00923657"/>
     <w:rPr>
       <w:rFonts w:eastAsiaTheme="majorEastAsia" w:cstheme="majorBidi"/>
       <w:color w:val="0F4761" w:themeColor="accent1" w:themeShade="BF"/>
@@ -14693,7 +14688,7 @@
     <w:link w:val="Heading6"/>
     <w:uiPriority w:val="9"/>
     <w:semiHidden/>
-    <w:rsid w:val="00DC64AF"/>
+    <w:rsid w:val="00923657"/>
     <w:rPr>
       <w:rFonts w:eastAsiaTheme="majorEastAsia" w:cstheme="majorBidi"/>
       <w:i/>
@@ -14707,7 +14702,7 @@
     <w:link w:val="Heading7"/>
     <w:uiPriority w:val="9"/>
     <w:semiHidden/>
-    <w:rsid w:val="00DC64AF"/>
+    <w:rsid w:val="00923657"/>
     <w:rPr>
       <w:rFonts w:eastAsiaTheme="majorEastAsia" w:cstheme="majorBidi"/>
       <w:color w:val="595959" w:themeColor="text1" w:themeTint="A6"/>
@@ -14719,7 +14714,7 @@
     <w:link w:val="Heading8"/>
     <w:uiPriority w:val="9"/>
     <w:semiHidden/>
-    <w:rsid w:val="00DC64AF"/>
+    <w:rsid w:val="00923657"/>
     <w:rPr>
       <w:rFonts w:eastAsiaTheme="majorEastAsia" w:cstheme="majorBidi"/>
       <w:i/>
@@ -14733,7 +14728,7 @@
     <w:link w:val="Heading9"/>
     <w:uiPriority w:val="9"/>
     <w:semiHidden/>
-    <w:rsid w:val="00DC64AF"/>
+    <w:rsid w:val="00923657"/>
     <w:rPr>
       <w:rFonts w:eastAsiaTheme="majorEastAsia" w:cstheme="majorBidi"/>
       <w:color w:val="272727" w:themeColor="text1" w:themeTint="D8"/>
@@ -14746,7 +14741,7 @@
     <w:link w:val="TitleChar"/>
     <w:uiPriority w:val="10"/>
     <w:qFormat/>
-    <w:rsid w:val="00DC64AF"/>
+    <w:rsid w:val="00923657"/>
     <w:pPr>
       <w:spacing w:after="80" w:line="240" w:lineRule="auto"/>
       <w:contextualSpacing/>
@@ -14764,7 +14759,7 @@
     <w:basedOn w:val="DefaultParagraphFont"/>
     <w:link w:val="Title"/>
     <w:uiPriority w:val="10"/>
-    <w:rsid w:val="00DC64AF"/>
+    <w:rsid w:val="00923657"/>
     <w:rPr>
       <w:rFonts w:asciiTheme="majorHAnsi" w:eastAsiaTheme="majorEastAsia" w:hAnsiTheme="majorHAnsi" w:cstheme="majorBidi"/>
       <w:spacing w:val="-10"/>
@@ -14780,7 +14775,7 @@
     <w:link w:val="SubtitleChar"/>
     <w:uiPriority w:val="11"/>
     <w:qFormat/>
-    <w:rsid w:val="00DC64AF"/>
+    <w:rsid w:val="00923657"/>
     <w:pPr>
       <w:numPr>
         <w:ilvl w:val="1"/>
@@ -14799,7 +14794,7 @@
     <w:basedOn w:val="DefaultParagraphFont"/>
     <w:link w:val="Subtitle"/>
     <w:uiPriority w:val="11"/>
-    <w:rsid w:val="00DC64AF"/>
+    <w:rsid w:val="00923657"/>
     <w:rPr>
       <w:rFonts w:eastAsiaTheme="majorEastAsia" w:cstheme="majorBidi"/>
       <w:color w:val="595959" w:themeColor="text1" w:themeTint="A6"/>
@@ -14815,7 +14810,7 @@
     <w:link w:val="QuoteChar"/>
     <w:uiPriority w:val="29"/>
     <w:qFormat/>
-    <w:rsid w:val="00DC64AF"/>
+    <w:rsid w:val="00923657"/>
     <w:pPr>
       <w:spacing w:before="160"/>
       <w:jc w:val="center"/>
@@ -14831,7 +14826,7 @@
     <w:basedOn w:val="DefaultParagraphFont"/>
     <w:link w:val="Quote"/>
     <w:uiPriority w:val="29"/>
-    <w:rsid w:val="00DC64AF"/>
+    <w:rsid w:val="00923657"/>
     <w:rPr>
       <w:i/>
       <w:iCs/>
@@ -14843,7 +14838,7 @@
     <w:basedOn w:val="Normal"/>
     <w:uiPriority w:val="34"/>
     <w:qFormat/>
-    <w:rsid w:val="00DC64AF"/>
+    <w:rsid w:val="00923657"/>
     <w:pPr>
       <w:ind w:left="720"/>
       <w:contextualSpacing/>
@@ -14854,7 +14849,7 @@
     <w:basedOn w:val="DefaultParagraphFont"/>
     <w:uiPriority w:val="21"/>
     <w:qFormat/>
-    <w:rsid w:val="00DC64AF"/>
+    <w:rsid w:val="00923657"/>
     <w:rPr>
       <w:i/>
       <w:iCs/>
@@ -14868,7 +14863,7 @@
     <w:link w:val="IntenseQuoteChar"/>
     <w:uiPriority w:val="30"/>
     <w:qFormat/>
-    <w:rsid w:val="00DC64AF"/>
+    <w:rsid w:val="00923657"/>
     <w:pPr>
       <w:pBdr>
         <w:top w:val="single" w:sz="4" w:space="10" w:color="0F4761" w:themeColor="accent1" w:themeShade="BF"/>
@@ -14889,7 +14884,7 @@
     <w:basedOn w:val="DefaultParagraphFont"/>
     <w:link w:val="IntenseQuote"/>
     <w:uiPriority w:val="30"/>
-    <w:rsid w:val="00DC64AF"/>
+    <w:rsid w:val="00923657"/>
     <w:rPr>
       <w:i/>
       <w:iCs/>
@@ -14901,7 +14896,7 @@
     <w:basedOn w:val="DefaultParagraphFont"/>
     <w:uiPriority w:val="32"/>
     <w:qFormat/>
-    <w:rsid w:val="00DC64AF"/>
+    <w:rsid w:val="00923657"/>
     <w:rPr>
       <w:b/>
       <w:bCs/>
@@ -14916,7 +14911,7 @@
     <w:link w:val="HeaderChar"/>
     <w:uiPriority w:val="99"/>
     <w:unhideWhenUsed/>
-    <w:rsid w:val="00DC64AF"/>
+    <w:rsid w:val="00923657"/>
     <w:pPr>
       <w:tabs>
         <w:tab w:val="center" w:pos="4680"/>
@@ -14938,7 +14933,7 @@
     <w:basedOn w:val="DefaultParagraphFont"/>
     <w:link w:val="Header"/>
     <w:uiPriority w:val="99"/>
-    <w:rsid w:val="00DC64AF"/>
+    <w:rsid w:val="00923657"/>
     <w:rPr>
       <w:rFonts w:ascii="Calibri" w:eastAsiaTheme="minorEastAsia" w:hAnsi="Calibri"/>
       <w:kern w:val="0"/>
@@ -14953,7 +14948,7 @@
     <w:basedOn w:val="DefaultParagraphFont"/>
     <w:uiPriority w:val="99"/>
     <w:unhideWhenUsed/>
-    <w:rsid w:val="00DC64AF"/>
+    <w:rsid w:val="00923657"/>
     <w:rPr>
       <w:color w:val="467886" w:themeColor="hyperlink"/>
       <w:u w:val="single"/>
@@ -14965,7 +14960,7 @@
     <w:link w:val="FooterChar"/>
     <w:uiPriority w:val="99"/>
     <w:unhideWhenUsed/>
-    <w:rsid w:val="00DC64AF"/>
+    <w:rsid w:val="00923657"/>
     <w:pPr>
       <w:tabs>
         <w:tab w:val="center" w:pos="4680"/>
@@ -14987,7 +14982,7 @@
     <w:basedOn w:val="DefaultParagraphFont"/>
     <w:link w:val="Footer"/>
     <w:uiPriority w:val="99"/>
-    <w:rsid w:val="00DC64AF"/>
+    <w:rsid w:val="00923657"/>
     <w:rPr>
       <w:rFonts w:ascii="Calibri" w:eastAsiaTheme="minorEastAsia" w:hAnsi="Calibri"/>
       <w:kern w:val="0"/>
@@ -15001,7 +14996,7 @@
     <w:name w:val="No Spacing"/>
     <w:uiPriority w:val="1"/>
     <w:qFormat/>
-    <w:rsid w:val="00DC64AF"/>
+    <w:rsid w:val="00923657"/>
     <w:pPr>
       <w:spacing w:after="0" w:line="240" w:lineRule="auto"/>
     </w:pPr>
@@ -15020,7 +15015,7 @@
     <w:link w:val="BodyTextChar"/>
     <w:uiPriority w:val="99"/>
     <w:unhideWhenUsed/>
-    <w:rsid w:val="00DC64AF"/>
+    <w:rsid w:val="00923657"/>
     <w:pPr>
       <w:spacing w:after="120" w:line="276" w:lineRule="auto"/>
     </w:pPr>
@@ -15038,7 +15033,7 @@
     <w:basedOn w:val="DefaultParagraphFont"/>
     <w:link w:val="BodyText"/>
     <w:uiPriority w:val="99"/>
-    <w:rsid w:val="00DC64AF"/>
+    <w:rsid w:val="00923657"/>
     <w:rPr>
       <w:rFonts w:ascii="Calibri" w:eastAsiaTheme="minorEastAsia" w:hAnsi="Calibri"/>
       <w:kern w:val="0"/>
@@ -15054,7 +15049,7 @@
     <w:link w:val="BodyText2Char"/>
     <w:uiPriority w:val="99"/>
     <w:unhideWhenUsed/>
-    <w:rsid w:val="00DC64AF"/>
+    <w:rsid w:val="00923657"/>
     <w:pPr>
       <w:spacing w:after="120" w:line="480" w:lineRule="auto"/>
     </w:pPr>
@@ -15072,7 +15067,7 @@
     <w:basedOn w:val="DefaultParagraphFont"/>
     <w:link w:val="BodyText2"/>
     <w:uiPriority w:val="99"/>
-    <w:rsid w:val="00DC64AF"/>
+    <w:rsid w:val="00923657"/>
     <w:rPr>
       <w:rFonts w:ascii="Calibri" w:eastAsiaTheme="minorEastAsia" w:hAnsi="Calibri"/>
       <w:kern w:val="0"/>
@@ -15088,7 +15083,7 @@
     <w:link w:val="BodyText3Char"/>
     <w:uiPriority w:val="99"/>
     <w:unhideWhenUsed/>
-    <w:rsid w:val="00DC64AF"/>
+    <w:rsid w:val="00923657"/>
     <w:pPr>
       <w:spacing w:after="120" w:line="276" w:lineRule="auto"/>
     </w:pPr>
@@ -15106,7 +15101,7 @@
     <w:basedOn w:val="DefaultParagraphFont"/>
     <w:link w:val="BodyText3"/>
     <w:uiPriority w:val="99"/>
-    <w:rsid w:val="00DC64AF"/>
+    <w:rsid w:val="00923657"/>
     <w:rPr>
       <w:rFonts w:ascii="Calibri" w:eastAsiaTheme="minorEastAsia" w:hAnsi="Calibri"/>
       <w:kern w:val="0"/>
@@ -15121,7 +15116,7 @@
     <w:basedOn w:val="Normal"/>
     <w:uiPriority w:val="99"/>
     <w:unhideWhenUsed/>
-    <w:rsid w:val="00DC64AF"/>
+    <w:rsid w:val="00923657"/>
     <w:pPr>
       <w:spacing w:after="200" w:line="276" w:lineRule="auto"/>
       <w:ind w:left="360" w:hanging="360"/>
@@ -15141,7 +15136,7 @@
     <w:basedOn w:val="Normal"/>
     <w:uiPriority w:val="99"/>
     <w:unhideWhenUsed/>
-    <w:rsid w:val="00DC64AF"/>
+    <w:rsid w:val="00923657"/>
     <w:pPr>
       <w:spacing w:after="200" w:line="276" w:lineRule="auto"/>
       <w:ind w:left="720" w:hanging="360"/>
@@ -15161,7 +15156,7 @@
     <w:basedOn w:val="Normal"/>
     <w:uiPriority w:val="99"/>
     <w:unhideWhenUsed/>
-    <w:rsid w:val="00DC64AF"/>
+    <w:rsid w:val="00923657"/>
     <w:pPr>
       <w:spacing w:after="200" w:line="276" w:lineRule="auto"/>
       <w:ind w:left="1080" w:hanging="360"/>
@@ -15181,7 +15176,7 @@
     <w:basedOn w:val="Normal"/>
     <w:uiPriority w:val="99"/>
     <w:unhideWhenUsed/>
-    <w:rsid w:val="00DC64AF"/>
+    <w:rsid w:val="00923657"/>
     <w:pPr>
       <w:numPr>
         <w:numId w:val="1"/>
@@ -15207,7 +15202,7 @@
     <w:basedOn w:val="Normal"/>
     <w:uiPriority w:val="99"/>
     <w:unhideWhenUsed/>
-    <w:rsid w:val="00DC64AF"/>
+    <w:rsid w:val="00923657"/>
     <w:pPr>
       <w:numPr>
         <w:numId w:val="2"/>
@@ -15233,7 +15228,7 @@
     <w:basedOn w:val="Normal"/>
     <w:uiPriority w:val="99"/>
     <w:unhideWhenUsed/>
-    <w:rsid w:val="00DC64AF"/>
+    <w:rsid w:val="00923657"/>
     <w:pPr>
       <w:numPr>
         <w:numId w:val="3"/>
@@ -15259,7 +15254,7 @@
     <w:basedOn w:val="Normal"/>
     <w:uiPriority w:val="99"/>
     <w:unhideWhenUsed/>
-    <w:rsid w:val="00DC64AF"/>
+    <w:rsid w:val="00923657"/>
     <w:pPr>
       <w:numPr>
         <w:numId w:val="5"/>
@@ -15285,7 +15280,7 @@
     <w:basedOn w:val="Normal"/>
     <w:uiPriority w:val="99"/>
     <w:unhideWhenUsed/>
-    <w:rsid w:val="00DC64AF"/>
+    <w:rsid w:val="00923657"/>
     <w:pPr>
       <w:numPr>
         <w:numId w:val="6"/>
@@ -15311,7 +15306,7 @@
     <w:basedOn w:val="Normal"/>
     <w:uiPriority w:val="99"/>
     <w:unhideWhenUsed/>
-    <w:rsid w:val="00DC64AF"/>
+    <w:rsid w:val="00923657"/>
     <w:pPr>
       <w:numPr>
         <w:numId w:val="7"/>
@@ -15337,7 +15332,7 @@
     <w:basedOn w:val="Normal"/>
     <w:uiPriority w:val="99"/>
     <w:unhideWhenUsed/>
-    <w:rsid w:val="00DC64AF"/>
+    <w:rsid w:val="00923657"/>
     <w:pPr>
       <w:spacing w:after="120" w:line="276" w:lineRule="auto"/>
       <w:ind w:left="360"/>
@@ -15357,7 +15352,7 @@
     <w:basedOn w:val="Normal"/>
     <w:uiPriority w:val="99"/>
     <w:unhideWhenUsed/>
-    <w:rsid w:val="00DC64AF"/>
+    <w:rsid w:val="00923657"/>
     <w:pPr>
       <w:spacing w:after="120" w:line="276" w:lineRule="auto"/>
       <w:ind w:left="720"/>
@@ -15377,7 +15372,7 @@
     <w:basedOn w:val="Normal"/>
     <w:uiPriority w:val="99"/>
     <w:unhideWhenUsed/>
-    <w:rsid w:val="00DC64AF"/>
+    <w:rsid w:val="00923657"/>
     <w:pPr>
       <w:spacing w:after="120" w:line="276" w:lineRule="auto"/>
       <w:ind w:left="1080"/>
@@ -15397,7 +15392,7 @@
     <w:link w:val="MacroTextChar"/>
     <w:uiPriority w:val="99"/>
     <w:unhideWhenUsed/>
-    <w:rsid w:val="00DC64AF"/>
+    <w:rsid w:val="00923657"/>
     <w:pPr>
       <w:tabs>
         <w:tab w:val="left" w:pos="576"/>
@@ -15424,7 +15419,7 @@
     <w:basedOn w:val="DefaultParagraphFont"/>
     <w:link w:val="MacroText"/>
     <w:uiPriority w:val="99"/>
-    <w:rsid w:val="00DC64AF"/>
+    <w:rsid w:val="00923657"/>
     <w:rPr>
       <w:rFonts w:ascii="Courier" w:eastAsiaTheme="minorEastAsia" w:hAnsi="Courier"/>
       <w:kern w:val="0"/>
@@ -15442,7 +15437,7 @@
     <w:semiHidden/>
     <w:unhideWhenUsed/>
     <w:qFormat/>
-    <w:rsid w:val="00DC64AF"/>
+    <w:rsid w:val="00923657"/>
     <w:pPr>
       <w:spacing w:after="200" w:line="240" w:lineRule="auto"/>
     </w:pPr>
@@ -15463,7 +15458,7 @@
     <w:basedOn w:val="DefaultParagraphFont"/>
     <w:uiPriority w:val="22"/>
     <w:qFormat/>
-    <w:rsid w:val="00DC64AF"/>
+    <w:rsid w:val="00923657"/>
     <w:rPr>
       <w:b/>
       <w:bCs/>
@@ -15474,7 +15469,7 @@
     <w:basedOn w:val="DefaultParagraphFont"/>
     <w:uiPriority w:val="20"/>
     <w:qFormat/>
-    <w:rsid w:val="00DC64AF"/>
+    <w:rsid w:val="00923657"/>
     <w:rPr>
       <w:i/>
       <w:iCs/>
@@ -15485,7 +15480,7 @@
     <w:basedOn w:val="DefaultParagraphFont"/>
     <w:uiPriority w:val="19"/>
     <w:qFormat/>
-    <w:rsid w:val="00DC64AF"/>
+    <w:rsid w:val="00923657"/>
     <w:rPr>
       <w:i/>
       <w:iCs/>
@@ -15497,7 +15492,7 @@
     <w:basedOn w:val="DefaultParagraphFont"/>
     <w:uiPriority w:val="31"/>
     <w:qFormat/>
-    <w:rsid w:val="00DC64AF"/>
+    <w:rsid w:val="00923657"/>
     <w:rPr>
       <w:smallCaps/>
       <w:color w:val="E97132" w:themeColor="accent2"/>
@@ -15509,7 +15504,7 @@
     <w:basedOn w:val="DefaultParagraphFont"/>
     <w:uiPriority w:val="33"/>
     <w:qFormat/>
-    <w:rsid w:val="00DC64AF"/>
+    <w:rsid w:val="00923657"/>
     <w:rPr>
       <w:b/>
       <w:bCs/>
@@ -15525,7 +15520,7 @@
     <w:semiHidden/>
     <w:unhideWhenUsed/>
     <w:qFormat/>
-    <w:rsid w:val="00DC64AF"/>
+    <w:rsid w:val="00923657"/>
     <w:pPr>
       <w:spacing w:before="480" w:after="0" w:line="276" w:lineRule="auto"/>
       <w:outlineLvl w:val="9"/>
@@ -15544,7 +15539,7 @@
     <w:name w:val="Table Grid"/>
     <w:basedOn w:val="TableNormal"/>
     <w:uiPriority w:val="59"/>
-    <w:rsid w:val="00DC64AF"/>
+    <w:rsid w:val="00923657"/>
     <w:pPr>
       <w:spacing w:after="0" w:line="240" w:lineRule="auto"/>
     </w:pPr>
@@ -15571,7 +15566,7 @@
     <w:name w:val="Light Shading"/>
     <w:basedOn w:val="TableNormal"/>
     <w:uiPriority w:val="60"/>
-    <w:rsid w:val="00DC64AF"/>
+    <w:rsid w:val="00923657"/>
     <w:pPr>
       <w:spacing w:after="0" w:line="240" w:lineRule="auto"/>
     </w:pPr>
@@ -15673,7 +15668,7 @@
     <w:name w:val="Light Shading Accent 1"/>
     <w:basedOn w:val="TableNormal"/>
     <w:uiPriority w:val="60"/>
-    <w:rsid w:val="00DC64AF"/>
+    <w:rsid w:val="00923657"/>
     <w:pPr>
       <w:spacing w:after="0" w:line="240" w:lineRule="auto"/>
     </w:pPr>
@@ -15775,7 +15770,7 @@
     <w:name w:val="Light Shading Accent 2"/>
     <w:basedOn w:val="TableNormal"/>
     <w:uiPriority w:val="60"/>
-    <w:rsid w:val="00DC64AF"/>
+    <w:rsid w:val="00923657"/>
     <w:pPr>
       <w:spacing w:after="0" w:line="240" w:lineRule="auto"/>
     </w:pPr>
@@ -15877,7 +15872,7 @@
     <w:name w:val="Light Shading Accent 3"/>
     <w:basedOn w:val="TableNormal"/>
     <w:uiPriority w:val="60"/>
-    <w:rsid w:val="00DC64AF"/>
+    <w:rsid w:val="00923657"/>
     <w:pPr>
       <w:spacing w:after="0" w:line="240" w:lineRule="auto"/>
     </w:pPr>
@@ -15979,7 +15974,7 @@
     <w:name w:val="Light Shading Accent 4"/>
     <w:basedOn w:val="TableNormal"/>
     <w:uiPriority w:val="60"/>
-    <w:rsid w:val="00DC64AF"/>
+    <w:rsid w:val="00923657"/>
     <w:pPr>
       <w:spacing w:after="0" w:line="240" w:lineRule="auto"/>
     </w:pPr>
@@ -16081,7 +16076,7 @@
     <w:name w:val="Light Shading Accent 5"/>
     <w:basedOn w:val="TableNormal"/>
     <w:uiPriority w:val="60"/>
-    <w:rsid w:val="00DC64AF"/>
+    <w:rsid w:val="00923657"/>
     <w:pPr>
       <w:spacing w:after="0" w:line="240" w:lineRule="auto"/>
     </w:pPr>
@@ -16183,7 +16178,7 @@
     <w:name w:val="Light Shading Accent 6"/>
     <w:basedOn w:val="TableNormal"/>
     <w:uiPriority w:val="60"/>
-    <w:rsid w:val="00DC64AF"/>
+    <w:rsid w:val="00923657"/>
     <w:pPr>
       <w:spacing w:after="0" w:line="240" w:lineRule="auto"/>
     </w:pPr>
@@ -16285,7 +16280,7 @@
     <w:name w:val="Light List"/>
     <w:basedOn w:val="TableNormal"/>
     <w:uiPriority w:val="61"/>
-    <w:rsid w:val="00DC64AF"/>
+    <w:rsid w:val="00923657"/>
     <w:pPr>
       <w:spacing w:after="0" w:line="240" w:lineRule="auto"/>
     </w:pPr>
@@ -16378,7 +16373,7 @@
     <w:name w:val="Light List Accent 1"/>
     <w:basedOn w:val="TableNormal"/>
     <w:uiPriority w:val="61"/>
-    <w:rsid w:val="00DC64AF"/>
+    <w:rsid w:val="00923657"/>
     <w:pPr>
       <w:spacing w:after="0" w:line="240" w:lineRule="auto"/>
     </w:pPr>
@@ -16471,7 +16466,7 @@
     <w:name w:val="Light List Accent 2"/>
     <w:basedOn w:val="TableNormal"/>
     <w:uiPriority w:val="61"/>
-    <w:rsid w:val="00DC64AF"/>
+    <w:rsid w:val="00923657"/>
     <w:pPr>
       <w:spacing w:after="0" w:line="240" w:lineRule="auto"/>
     </w:pPr>
@@ -16564,7 +16559,7 @@
     <w:name w:val="Light List Accent 3"/>
     <w:basedOn w:val="TableNormal"/>
     <w:uiPriority w:val="61"/>
-    <w:rsid w:val="00DC64AF"/>
+    <w:rsid w:val="00923657"/>
     <w:pPr>
       <w:spacing w:after="0" w:line="240" w:lineRule="auto"/>
     </w:pPr>
@@ -16657,7 +16652,7 @@
     <w:name w:val="Light List Accent 4"/>
     <w:basedOn w:val="TableNormal"/>
     <w:uiPriority w:val="61"/>
-    <w:rsid w:val="00DC64AF"/>
+    <w:rsid w:val="00923657"/>
     <w:pPr>
       <w:spacing w:after="0" w:line="240" w:lineRule="auto"/>
     </w:pPr>
@@ -16750,7 +16745,7 @@
     <w:name w:val="Light List Accent 5"/>
     <w:basedOn w:val="TableNormal"/>
     <w:uiPriority w:val="61"/>
-    <w:rsid w:val="00DC64AF"/>
+    <w:rsid w:val="00923657"/>
     <w:pPr>
       <w:spacing w:after="0" w:line="240" w:lineRule="auto"/>
     </w:pPr>
@@ -16843,7 +16838,7 @@
     <w:name w:val="Light List Accent 6"/>
     <w:basedOn w:val="TableNormal"/>
     <w:uiPriority w:val="61"/>
-    <w:rsid w:val="00DC64AF"/>
+    <w:rsid w:val="00923657"/>
     <w:pPr>
       <w:spacing w:after="0" w:line="240" w:lineRule="auto"/>
     </w:pPr>
@@ -16936,7 +16931,7 @@
     <w:name w:val="Light Grid"/>
     <w:basedOn w:val="TableNormal"/>
     <w:uiPriority w:val="62"/>
-    <w:rsid w:val="00DC64AF"/>
+    <w:rsid w:val="00923657"/>
     <w:pPr>
       <w:spacing w:after="0" w:line="240" w:lineRule="auto"/>
     </w:pPr>
@@ -17067,7 +17062,7 @@
     <w:name w:val="Light Grid Accent 1"/>
     <w:basedOn w:val="TableNormal"/>
     <w:uiPriority w:val="62"/>
-    <w:rsid w:val="00DC64AF"/>
+    <w:rsid w:val="00923657"/>
     <w:pPr>
       <w:spacing w:after="0" w:line="240" w:lineRule="auto"/>
     </w:pPr>
@@ -17198,7 +17193,7 @@
     <w:name w:val="Light Grid Accent 2"/>
     <w:basedOn w:val="TableNormal"/>
     <w:uiPriority w:val="62"/>
-    <w:rsid w:val="00DC64AF"/>
+    <w:rsid w:val="00923657"/>
     <w:pPr>
       <w:spacing w:after="0" w:line="240" w:lineRule="auto"/>
     </w:pPr>
@@ -17329,7 +17324,7 @@
     <w:name w:val="Light Grid Accent 3"/>
     <w:basedOn w:val="TableNormal"/>
     <w:uiPriority w:val="62"/>
-    <w:rsid w:val="00DC64AF"/>
+    <w:rsid w:val="00923657"/>
     <w:pPr>
       <w:spacing w:after="0" w:line="240" w:lineRule="auto"/>
     </w:pPr>
@@ -17460,7 +17455,7 @@
     <w:name w:val="Light Grid Accent 4"/>
     <w:basedOn w:val="TableNormal"/>
     <w:uiPriority w:val="62"/>
-    <w:rsid w:val="00DC64AF"/>
+    <w:rsid w:val="00923657"/>
     <w:pPr>
       <w:spacing w:after="0" w:line="240" w:lineRule="auto"/>
     </w:pPr>
@@ -17591,7 +17586,7 @@
     <w:name w:val="Light Grid Accent 5"/>
     <w:basedOn w:val="TableNormal"/>
     <w:uiPriority w:val="62"/>
-    <w:rsid w:val="00DC64AF"/>
+    <w:rsid w:val="00923657"/>
     <w:pPr>
       <w:spacing w:after="0" w:line="240" w:lineRule="auto"/>
     </w:pPr>
@@ -17722,7 +17717,7 @@
     <w:name w:val="Light Grid Accent 6"/>
     <w:basedOn w:val="TableNormal"/>
     <w:uiPriority w:val="62"/>
-    <w:rsid w:val="00DC64AF"/>
+    <w:rsid w:val="00923657"/>
     <w:pPr>
       <w:spacing w:after="0" w:line="240" w:lineRule="auto"/>
     </w:pPr>
@@ -17853,7 +17848,7 @@
     <w:name w:val="Medium Shading 1"/>
     <w:basedOn w:val="TableNormal"/>
     <w:uiPriority w:val="63"/>
-    <w:rsid w:val="00DC64AF"/>
+    <w:rsid w:val="00923657"/>
     <w:pPr>
       <w:spacing w:after="0" w:line="240" w:lineRule="auto"/>
     </w:pPr>
@@ -17960,7 +17955,7 @@
     <w:name w:val="Medium Shading 1 Accent 1"/>
     <w:basedOn w:val="TableNormal"/>
     <w:uiPriority w:val="63"/>
-    <w:rsid w:val="00DC64AF"/>
+    <w:rsid w:val="00923657"/>
     <w:pPr>
       <w:spacing w:after="0" w:line="240" w:lineRule="auto"/>
     </w:pPr>
@@ -18067,7 +18062,7 @@
     <w:name w:val="Medium Shading 1 Accent 2"/>
     <w:basedOn w:val="TableNormal"/>
     <w:uiPriority w:val="63"/>
-    <w:rsid w:val="00DC64AF"/>
+    <w:rsid w:val="00923657"/>
     <w:pPr>
       <w:spacing w:after="0" w:line="240" w:lineRule="auto"/>
     </w:pPr>
@@ -18174,7 +18169,7 @@
     <w:name w:val="Medium Shading 1 Accent 3"/>
     <w:basedOn w:val="TableNormal"/>
     <w:uiPriority w:val="63"/>
-    <w:rsid w:val="00DC64AF"/>
+    <w:rsid w:val="00923657"/>
     <w:pPr>
       <w:spacing w:after="0" w:line="240" w:lineRule="auto"/>
     </w:pPr>
@@ -18281,7 +18276,7 @@
     <w:name w:val="Medium Shading 1 Accent 4"/>
     <w:basedOn w:val="TableNormal"/>
     <w:uiPriority w:val="63"/>
-    <w:rsid w:val="00DC64AF"/>
+    <w:rsid w:val="00923657"/>
     <w:pPr>
       <w:spacing w:after="0" w:line="240" w:lineRule="auto"/>
     </w:pPr>
@@ -18388,7 +18383,7 @@
     <w:name w:val="Medium Shading 1 Accent 5"/>
     <w:basedOn w:val="TableNormal"/>
     <w:uiPriority w:val="63"/>
-    <w:rsid w:val="00DC64AF"/>
+    <w:rsid w:val="00923657"/>
     <w:pPr>
       <w:spacing w:after="0" w:line="240" w:lineRule="auto"/>
     </w:pPr>
@@ -18495,7 +18490,7 @@
     <w:name w:val="Medium Shading 1 Accent 6"/>
     <w:basedOn w:val="TableNormal"/>
     <w:uiPriority w:val="63"/>
-    <w:rsid w:val="00DC64AF"/>
+    <w:rsid w:val="00923657"/>
     <w:pPr>
       <w:spacing w:after="0" w:line="240" w:lineRule="auto"/>
     </w:pPr>
@@ -18602,7 +18597,7 @@
     <w:name w:val="Medium Shading 2"/>
     <w:basedOn w:val="TableNormal"/>
     <w:uiPriority w:val="64"/>
-    <w:rsid w:val="00DC64AF"/>
+    <w:rsid w:val="00923657"/>
     <w:pPr>
       <w:spacing w:after="0" w:line="240" w:lineRule="auto"/>
     </w:pPr>
@@ -18752,7 +18747,7 @@
     <w:name w:val="Medium Shading 2 Accent 1"/>
     <w:basedOn w:val="TableNormal"/>
     <w:uiPriority w:val="64"/>
-    <w:rsid w:val="00DC64AF"/>
+    <w:rsid w:val="00923657"/>
     <w:pPr>
       <w:spacing w:after="0" w:line="240" w:lineRule="auto"/>
     </w:pPr>
@@ -18902,7 +18897,7 @@
     <w:name w:val="Medium Shading 2 Accent 2"/>
     <w:basedOn w:val="TableNormal"/>
     <w:uiPriority w:val="64"/>
-    <w:rsid w:val="00DC64AF"/>
+    <w:rsid w:val="00923657"/>
     <w:pPr>
       <w:spacing w:after="0" w:line="240" w:lineRule="auto"/>
     </w:pPr>
@@ -19052,7 +19047,7 @@
     <w:name w:val="Medium Shading 2 Accent 3"/>
     <w:basedOn w:val="TableNormal"/>
     <w:uiPriority w:val="64"/>
-    <w:rsid w:val="00DC64AF"/>
+    <w:rsid w:val="00923657"/>
     <w:pPr>
       <w:spacing w:after="0" w:line="240" w:lineRule="auto"/>
     </w:pPr>
@@ -19202,7 +19197,7 @@
     <w:name w:val="Medium Shading 2 Accent 4"/>
     <w:basedOn w:val="TableNormal"/>
     <w:uiPriority w:val="64"/>
-    <w:rsid w:val="00DC64AF"/>
+    <w:rsid w:val="00923657"/>
     <w:pPr>
       <w:spacing w:after="0" w:line="240" w:lineRule="auto"/>
     </w:pPr>
@@ -19352,7 +19347,7 @@
     <w:name w:val="Medium Shading 2 Accent 5"/>
     <w:basedOn w:val="TableNormal"/>
     <w:uiPriority w:val="64"/>
-    <w:rsid w:val="00DC64AF"/>
+    <w:rsid w:val="00923657"/>
     <w:pPr>
       <w:spacing w:after="0" w:line="240" w:lineRule="auto"/>
     </w:pPr>
@@ -19502,7 +19497,7 @@
     <w:name w:val="Medium Shading 2 Accent 6"/>
     <w:basedOn w:val="TableNormal"/>
     <w:uiPriority w:val="64"/>
-    <w:rsid w:val="00DC64AF"/>
+    <w:rsid w:val="00923657"/>
     <w:pPr>
       <w:spacing w:after="0" w:line="240" w:lineRule="auto"/>
     </w:pPr>
@@ -19652,7 +19647,7 @@
     <w:name w:val="Medium List 1"/>
     <w:basedOn w:val="TableNormal"/>
     <w:uiPriority w:val="65"/>
-    <w:rsid w:val="00DC64AF"/>
+    <w:rsid w:val="00923657"/>
     <w:pPr>
       <w:spacing w:after="0" w:line="240" w:lineRule="auto"/>
     </w:pPr>
@@ -19735,7 +19730,7 @@
     <w:name w:val="Medium List 1 Accent 1"/>
     <w:basedOn w:val="TableNormal"/>
     <w:uiPriority w:val="65"/>
-    <w:rsid w:val="00DC64AF"/>
+    <w:rsid w:val="00923657"/>
     <w:pPr>
       <w:spacing w:after="0" w:line="240" w:lineRule="auto"/>
     </w:pPr>
@@ -19818,7 +19813,7 @@
     <w:name w:val="Medium List 1 Accent 2"/>
     <w:basedOn w:val="TableNormal"/>
     <w:uiPriority w:val="65"/>
-    <w:rsid w:val="00DC64AF"/>
+    <w:rsid w:val="00923657"/>
     <w:pPr>
       <w:spacing w:after="0" w:line="240" w:lineRule="auto"/>
     </w:pPr>
@@ -19901,7 +19896,7 @@
     <w:name w:val="Medium List 1 Accent 3"/>
     <w:basedOn w:val="TableNormal"/>
     <w:uiPriority w:val="65"/>
-    <w:rsid w:val="00DC64AF"/>
+    <w:rsid w:val="00923657"/>
     <w:pPr>
       <w:spacing w:after="0" w:line="240" w:lineRule="auto"/>
     </w:pPr>
@@ -19984,7 +19979,7 @@
     <w:name w:val="Medium List 1 Accent 4"/>
     <w:basedOn w:val="TableNormal"/>
     <w:uiPriority w:val="65"/>
-    <w:rsid w:val="00DC64AF"/>
+    <w:rsid w:val="00923657"/>
     <w:pPr>
       <w:spacing w:after="0" w:line="240" w:lineRule="auto"/>
     </w:pPr>
@@ -20067,7 +20062,7 @@
     <w:name w:val="Medium List 1 Accent 5"/>
     <w:basedOn w:val="TableNormal"/>
     <w:uiPriority w:val="65"/>
-    <w:rsid w:val="00DC64AF"/>
+    <w:rsid w:val="00923657"/>
     <w:pPr>
       <w:spacing w:after="0" w:line="240" w:lineRule="auto"/>
     </w:pPr>
@@ -20150,7 +20145,7 @@
     <w:name w:val="Medium List 1 Accent 6"/>
     <w:basedOn w:val="TableNormal"/>
     <w:uiPriority w:val="65"/>
-    <w:rsid w:val="00DC64AF"/>
+    <w:rsid w:val="00923657"/>
     <w:pPr>
       <w:spacing w:after="0" w:line="240" w:lineRule="auto"/>
     </w:pPr>
@@ -20233,7 +20228,7 @@
     <w:name w:val="Medium List 2"/>
     <w:basedOn w:val="TableNormal"/>
     <w:uiPriority w:val="66"/>
-    <w:rsid w:val="00DC64AF"/>
+    <w:rsid w:val="00923657"/>
     <w:pPr>
       <w:spacing w:after="0" w:line="240" w:lineRule="auto"/>
     </w:pPr>
@@ -20359,7 +20354,7 @@
     <w:name w:val="Medium List 2 Accent 1"/>
     <w:basedOn w:val="TableNormal"/>
     <w:uiPriority w:val="66"/>
-    <w:rsid w:val="00DC64AF"/>
+    <w:rsid w:val="00923657"/>
     <w:pPr>
       <w:spacing w:after="0" w:line="240" w:lineRule="auto"/>
     </w:pPr>
@@ -20485,7 +20480,7 @@
     <w:name w:val="Medium List 2 Accent 2"/>
     <w:basedOn w:val="TableNormal"/>
     <w:uiPriority w:val="66"/>
-    <w:rsid w:val="00DC64AF"/>
+    <w:rsid w:val="00923657"/>
     <w:pPr>
       <w:spacing w:after="0" w:line="240" w:lineRule="auto"/>
     </w:pPr>
@@ -20611,7 +20606,7 @@
     <w:name w:val="Medium List 2 Accent 3"/>
     <w:basedOn w:val="TableNormal"/>
     <w:uiPriority w:val="66"/>
-    <w:rsid w:val="00DC64AF"/>
+    <w:rsid w:val="00923657"/>
     <w:pPr>
       <w:spacing w:after="0" w:line="240" w:lineRule="auto"/>
     </w:pPr>
@@ -20737,7 +20732,7 @@
     <w:name w:val="Medium List 2 Accent 4"/>
     <w:basedOn w:val="TableNormal"/>
     <w:uiPriority w:val="66"/>
-    <w:rsid w:val="00DC64AF"/>
+    <w:rsid w:val="00923657"/>
     <w:pPr>
       <w:spacing w:after="0" w:line="240" w:lineRule="auto"/>
     </w:pPr>
@@ -20863,7 +20858,7 @@
     <w:name w:val="Medium List 2 Accent 5"/>
     <w:basedOn w:val="TableNormal"/>
     <w:uiPriority w:val="66"/>
-    <w:rsid w:val="00DC64AF"/>
+    <w:rsid w:val="00923657"/>
     <w:pPr>
       <w:spacing w:after="0" w:line="240" w:lineRule="auto"/>
     </w:pPr>
@@ -20989,7 +20984,7 @@
     <w:name w:val="Medium List 2 Accent 6"/>
     <w:basedOn w:val="TableNormal"/>
     <w:uiPriority w:val="66"/>
-    <w:rsid w:val="00DC64AF"/>
+    <w:rsid w:val="00923657"/>
     <w:pPr>
       <w:spacing w:after="0" w:line="240" w:lineRule="auto"/>
     </w:pPr>
@@ -21115,7 +21110,7 @@
     <w:name w:val="Medium Grid 1"/>
     <w:basedOn w:val="TableNormal"/>
     <w:uiPriority w:val="67"/>
-    <w:rsid w:val="00DC64AF"/>
+    <w:rsid w:val="00923657"/>
     <w:pPr>
       <w:spacing w:after="0" w:line="240" w:lineRule="auto"/>
     </w:pPr>
@@ -21189,7 +21184,7 @@
     <w:name w:val="Medium Grid 1 Accent 1"/>
     <w:basedOn w:val="TableNormal"/>
     <w:uiPriority w:val="67"/>
-    <w:rsid w:val="00DC64AF"/>
+    <w:rsid w:val="00923657"/>
     <w:pPr>
       <w:spacing w:after="0" w:line="240" w:lineRule="auto"/>
     </w:pPr>
@@ -21263,7 +21258,7 @@
     <w:name w:val="Medium Grid 1 Accent 2"/>
     <w:basedOn w:val="TableNormal"/>
     <w:uiPriority w:val="67"/>
-    <w:rsid w:val="00DC64AF"/>
+    <w:rsid w:val="00923657"/>
     <w:pPr>
       <w:spacing w:after="0" w:line="240" w:lineRule="auto"/>
     </w:pPr>
@@ -21337,7 +21332,7 @@
     <w:name w:val="Medium Grid 1 Accent 3"/>
     <w:basedOn w:val="TableNormal"/>
     <w:uiPriority w:val="67"/>
-    <w:rsid w:val="00DC64AF"/>
+    <w:rsid w:val="00923657"/>
     <w:pPr>
       <w:spacing w:after="0" w:line="240" w:lineRule="auto"/>
     </w:pPr>
@@ -21411,7 +21406,7 @@
     <w:name w:val="Medium Grid 1 Accent 4"/>
     <w:basedOn w:val="TableNormal"/>
     <w:uiPriority w:val="67"/>
-    <w:rsid w:val="00DC64AF"/>
+    <w:rsid w:val="00923657"/>
     <w:pPr>
       <w:spacing w:after="0" w:line="240" w:lineRule="auto"/>
     </w:pPr>
@@ -21485,7 +21480,7 @@
     <w:name w:val="Medium Grid 1 Accent 5"/>
     <w:basedOn w:val="TableNormal"/>
     <w:uiPriority w:val="67"/>
-    <w:rsid w:val="00DC64AF"/>
+    <w:rsid w:val="00923657"/>
     <w:pPr>
       <w:spacing w:after="0" w:line="240" w:lineRule="auto"/>
     </w:pPr>
@@ -21559,7 +21554,7 @@
     <w:name w:val="Medium Grid 1 Accent 6"/>
     <w:basedOn w:val="TableNormal"/>
     <w:uiPriority w:val="67"/>
-    <w:rsid w:val="00DC64AF"/>
+    <w:rsid w:val="00923657"/>
     <w:pPr>
       <w:spacing w:after="0" w:line="240" w:lineRule="auto"/>
     </w:pPr>
@@ -21633,7 +21628,7 @@
     <w:name w:val="Medium Grid 2"/>
     <w:basedOn w:val="TableNormal"/>
     <w:uiPriority w:val="68"/>
-    <w:rsid w:val="00DC64AF"/>
+    <w:rsid w:val="00923657"/>
     <w:pPr>
       <w:spacing w:after="0" w:line="240" w:lineRule="auto"/>
     </w:pPr>
@@ -21756,7 +21751,7 @@
     <w:name w:val="Medium Grid 2 Accent 1"/>
     <w:basedOn w:val="TableNormal"/>
     <w:uiPriority w:val="68"/>
-    <w:rsid w:val="00DC64AF"/>
+    <w:rsid w:val="00923657"/>
     <w:pPr>
       <w:spacing w:after="0" w:line="240" w:lineRule="auto"/>
     </w:pPr>
@@ -21879,7 +21874,7 @@
     <w:name w:val="Medium Grid 2 Accent 2"/>
     <w:basedOn w:val="TableNormal"/>
     <w:uiPriority w:val="68"/>
-    <w:rsid w:val="00DC64AF"/>
+    <w:rsid w:val="00923657"/>
     <w:pPr>
       <w:spacing w:after="0" w:line="240" w:lineRule="auto"/>
     </w:pPr>
@@ -22002,7 +21997,7 @@
     <w:name w:val="Medium Grid 2 Accent 3"/>
     <w:basedOn w:val="TableNormal"/>
     <w:uiPriority w:val="68"/>
-    <w:rsid w:val="00DC64AF"/>
+    <w:rsid w:val="00923657"/>
     <w:pPr>
       <w:spacing w:after="0" w:line="240" w:lineRule="auto"/>
     </w:pPr>
@@ -22125,7 +22120,7 @@
     <w:name w:val="Medium Grid 2 Accent 4"/>
     <w:basedOn w:val="TableNormal"/>
     <w:uiPriority w:val="68"/>
-    <w:rsid w:val="00DC64AF"/>
+    <w:rsid w:val="00923657"/>
     <w:pPr>
       <w:spacing w:after="0" w:line="240" w:lineRule="auto"/>
     </w:pPr>
@@ -22248,7 +22243,7 @@
     <w:name w:val="Medium Grid 2 Accent 5"/>
     <w:basedOn w:val="TableNormal"/>
     <w:uiPriority w:val="68"/>
-    <w:rsid w:val="00DC64AF"/>
+    <w:rsid w:val="00923657"/>
     <w:pPr>
       <w:spacing w:after="0" w:line="240" w:lineRule="auto"/>
     </w:pPr>
@@ -22371,7 +22366,7 @@
     <w:name w:val="Medium Grid 2 Accent 6"/>
     <w:basedOn w:val="TableNormal"/>
     <w:uiPriority w:val="68"/>
-    <w:rsid w:val="00DC64AF"/>
+    <w:rsid w:val="00923657"/>
     <w:pPr>
       <w:spacing w:after="0" w:line="240" w:lineRule="auto"/>
     </w:pPr>
@@ -22494,7 +22489,7 @@
     <w:name w:val="Medium Grid 3"/>
     <w:basedOn w:val="TableNormal"/>
     <w:uiPriority w:val="69"/>
-    <w:rsid w:val="00DC64AF"/>
+    <w:rsid w:val="00923657"/>
     <w:pPr>
       <w:spacing w:after="0" w:line="240" w:lineRule="auto"/>
     </w:pPr>
@@ -22636,7 +22631,7 @@
     <w:name w:val="Medium Grid 3 Accent 1"/>
     <w:basedOn w:val="TableNormal"/>
     <w:uiPriority w:val="69"/>
-    <w:rsid w:val="00DC64AF"/>
+    <w:rsid w:val="00923657"/>
     <w:pPr>
       <w:spacing w:after="0" w:line="240" w:lineRule="auto"/>
     </w:pPr>
@@ -22778,7 +22773,7 @@
     <w:name w:val="Medium Grid 3 Accent 2"/>
     <w:basedOn w:val="TableNormal"/>
     <w:uiPriority w:val="69"/>
-    <w:rsid w:val="00DC64AF"/>
+    <w:rsid w:val="00923657"/>
     <w:pPr>
       <w:spacing w:after="0" w:line="240" w:lineRule="auto"/>
     </w:pPr>
@@ -22920,7 +22915,7 @@
     <w:name w:val="Medium Grid 3 Accent 3"/>
     <w:basedOn w:val="TableNormal"/>
     <w:uiPriority w:val="69"/>
-    <w:rsid w:val="00DC64AF"/>
+    <w:rsid w:val="00923657"/>
     <w:pPr>
       <w:spacing w:after="0" w:line="240" w:lineRule="auto"/>
     </w:pPr>
@@ -23062,7 +23057,7 @@
     <w:name w:val="Medium Grid 3 Accent 4"/>
     <w:basedOn w:val="TableNormal"/>
     <w:uiPriority w:val="69"/>
-    <w:rsid w:val="00DC64AF"/>
+    <w:rsid w:val="00923657"/>
     <w:pPr>
       <w:spacing w:after="0" w:line="240" w:lineRule="auto"/>
     </w:pPr>
@@ -23204,7 +23199,7 @@
     <w:name w:val="Medium Grid 3 Accent 5"/>
     <w:basedOn w:val="TableNormal"/>
     <w:uiPriority w:val="69"/>
-    <w:rsid w:val="00DC64AF"/>
+    <w:rsid w:val="00923657"/>
     <w:pPr>
       <w:spacing w:after="0" w:line="240" w:lineRule="auto"/>
     </w:pPr>
@@ -23346,7 +23341,7 @@
     <w:name w:val="Medium Grid 3 Accent 6"/>
     <w:basedOn w:val="TableNormal"/>
     <w:uiPriority w:val="69"/>
-    <w:rsid w:val="00DC64AF"/>
+    <w:rsid w:val="00923657"/>
     <w:pPr>
       <w:spacing w:after="0" w:line="240" w:lineRule="auto"/>
     </w:pPr>
@@ -23488,7 +23483,7 @@
     <w:name w:val="Dark List"/>
     <w:basedOn w:val="TableNormal"/>
     <w:uiPriority w:val="70"/>
-    <w:rsid w:val="00DC64AF"/>
+    <w:rsid w:val="00923657"/>
     <w:pPr>
       <w:spacing w:after="0" w:line="240" w:lineRule="auto"/>
     </w:pPr>
@@ -23601,7 +23596,7 @@
     <w:name w:val="Dark List Accent 1"/>
     <w:basedOn w:val="TableNormal"/>
     <w:uiPriority w:val="70"/>
-    <w:rsid w:val="00DC64AF"/>
+    <w:rsid w:val="00923657"/>
     <w:pPr>
       <w:spacing w:after="0" w:line="240" w:lineRule="auto"/>
     </w:pPr>
@@ -23714,7 +23709,7 @@
     <w:name w:val="Dark List Accent 2"/>
     <w:basedOn w:val="TableNormal"/>
     <w:uiPriority w:val="70"/>
-    <w:rsid w:val="00DC64AF"/>
+    <w:rsid w:val="00923657"/>
     <w:pPr>
       <w:spacing w:after="0" w:line="240" w:lineRule="auto"/>
     </w:pPr>
@@ -23827,7 +23822,7 @@
     <w:name w:val="Dark List Accent 3"/>
     <w:basedOn w:val="TableNormal"/>
     <w:uiPriority w:val="70"/>
-    <w:rsid w:val="00DC64AF"/>
+    <w:rsid w:val="00923657"/>
     <w:pPr>
       <w:spacing w:after="0" w:line="240" w:lineRule="auto"/>
     </w:pPr>
@@ -23940,7 +23935,7 @@
     <w:name w:val="Dark List Accent 4"/>
     <w:basedOn w:val="TableNormal"/>
     <w:uiPriority w:val="70"/>
-    <w:rsid w:val="00DC64AF"/>
+    <w:rsid w:val="00923657"/>
     <w:pPr>
       <w:spacing w:after="0" w:line="240" w:lineRule="auto"/>
     </w:pPr>
@@ -24053,7 +24048,7 @@
     <w:name w:val="Dark List Accent 5"/>
     <w:basedOn w:val="TableNormal"/>
     <w:uiPriority w:val="70"/>
-    <w:rsid w:val="00DC64AF"/>
+    <w:rsid w:val="00923657"/>
     <w:pPr>
       <w:spacing w:after="0" w:line="240" w:lineRule="auto"/>
     </w:pPr>
@@ -24166,7 +24161,7 @@
     <w:name w:val="Dark List Accent 6"/>
     <w:basedOn w:val="TableNormal"/>
     <w:uiPriority w:val="70"/>
-    <w:rsid w:val="00DC64AF"/>
+    <w:rsid w:val="00923657"/>
     <w:pPr>
       <w:spacing w:after="0" w:line="240" w:lineRule="auto"/>
     </w:pPr>
@@ -24279,7 +24274,7 @@
     <w:name w:val="Colorful Shading"/>
     <w:basedOn w:val="TableNormal"/>
     <w:uiPriority w:val="71"/>
-    <w:rsid w:val="00DC64AF"/>
+    <w:rsid w:val="00923657"/>
     <w:pPr>
       <w:spacing w:after="0" w:line="240" w:lineRule="auto"/>
     </w:pPr>
@@ -24400,7 +24395,7 @@
     <w:name w:val="Colorful Shading Accent 1"/>
     <w:basedOn w:val="TableNormal"/>
     <w:uiPriority w:val="71"/>
-    <w:rsid w:val="00DC64AF"/>
+    <w:rsid w:val="00923657"/>
     <w:pPr>
       <w:spacing w:after="0" w:line="240" w:lineRule="auto"/>
     </w:pPr>
@@ -24521,7 +24516,7 @@
     <w:name w:val="Colorful Shading Accent 2"/>
     <w:basedOn w:val="TableNormal"/>
     <w:uiPriority w:val="71"/>
-    <w:rsid w:val="00DC64AF"/>
+    <w:rsid w:val="00923657"/>
     <w:pPr>
       <w:spacing w:after="0" w:line="240" w:lineRule="auto"/>
     </w:pPr>
@@ -24642,7 +24637,7 @@
     <w:name w:val="Colorful Shading Accent 3"/>
     <w:basedOn w:val="TableNormal"/>
     <w:uiPriority w:val="71"/>
-    <w:rsid w:val="00DC64AF"/>
+    <w:rsid w:val="00923657"/>
     <w:pPr>
       <w:spacing w:after="0" w:line="240" w:lineRule="auto"/>
     </w:pPr>
@@ -24753,7 +24748,7 @@
     <w:name w:val="Colorful Shading Accent 4"/>
     <w:basedOn w:val="TableNormal"/>
     <w:uiPriority w:val="71"/>
-    <w:rsid w:val="00DC64AF"/>
+    <w:rsid w:val="00923657"/>
     <w:pPr>
       <w:spacing w:after="0" w:line="240" w:lineRule="auto"/>
     </w:pPr>
@@ -24874,7 +24869,7 @@
     <w:name w:val="Colorful Shading Accent 5"/>
     <w:basedOn w:val="TableNormal"/>
     <w:uiPriority w:val="71"/>
-    <w:rsid w:val="00DC64AF"/>
+    <w:rsid w:val="00923657"/>
     <w:pPr>
       <w:spacing w:after="0" w:line="240" w:lineRule="auto"/>
     </w:pPr>
@@ -24995,7 +24990,7 @@
     <w:name w:val="Colorful Shading Accent 6"/>
     <w:basedOn w:val="TableNormal"/>
     <w:uiPriority w:val="71"/>
-    <w:rsid w:val="00DC64AF"/>
+    <w:rsid w:val="00923657"/>
     <w:pPr>
       <w:spacing w:after="0" w:line="240" w:lineRule="auto"/>
     </w:pPr>
@@ -25116,7 +25111,7 @@
     <w:name w:val="Colorful List"/>
     <w:basedOn w:val="TableNormal"/>
     <w:uiPriority w:val="72"/>
-    <w:rsid w:val="00DC64AF"/>
+    <w:rsid w:val="00923657"/>
     <w:pPr>
       <w:spacing w:after="0" w:line="240" w:lineRule="auto"/>
     </w:pPr>
@@ -25201,7 +25196,7 @@
     <w:name w:val="Colorful List Accent 1"/>
     <w:basedOn w:val="TableNormal"/>
     <w:uiPriority w:val="72"/>
-    <w:rsid w:val="00DC64AF"/>
+    <w:rsid w:val="00923657"/>
     <w:pPr>
       <w:spacing w:after="0" w:line="240" w:lineRule="auto"/>
     </w:pPr>
@@ -25286,7 +25281,7 @@
     <w:name w:val="Colorful List Accent 2"/>
     <w:basedOn w:val="TableNormal"/>
     <w:uiPriority w:val="72"/>
-    <w:rsid w:val="00DC64AF"/>
+    <w:rsid w:val="00923657"/>
     <w:pPr>
       <w:spacing w:after="0" w:line="240" w:lineRule="auto"/>
     </w:pPr>
@@ -25371,7 +25366,7 @@
     <w:name w:val="Colorful List Accent 3"/>
     <w:basedOn w:val="TableNormal"/>
     <w:uiPriority w:val="72"/>
-    <w:rsid w:val="00DC64AF"/>
+    <w:rsid w:val="00923657"/>
     <w:pPr>
       <w:spacing w:after="0" w:line="240" w:lineRule="auto"/>
     </w:pPr>
@@ -25456,7 +25451,7 @@
     <w:name w:val="Colorful List Accent 4"/>
     <w:basedOn w:val="TableNormal"/>
     <w:uiPriority w:val="72"/>
-    <w:rsid w:val="00DC64AF"/>
+    <w:rsid w:val="00923657"/>
     <w:pPr>
       <w:spacing w:after="0" w:line="240" w:lineRule="auto"/>
     </w:pPr>
@@ -25541,7 +25536,7 @@
     <w:name w:val="Colorful List Accent 5"/>
     <w:basedOn w:val="TableNormal"/>
     <w:uiPriority w:val="72"/>
-    <w:rsid w:val="00DC64AF"/>
+    <w:rsid w:val="00923657"/>
     <w:pPr>
       <w:spacing w:after="0" w:line="240" w:lineRule="auto"/>
     </w:pPr>
@@ -25626,7 +25621,7 @@
     <w:name w:val="Colorful List Accent 6"/>
     <w:basedOn w:val="TableNormal"/>
     <w:uiPriority w:val="72"/>
-    <w:rsid w:val="00DC64AF"/>
+    <w:rsid w:val="00923657"/>
     <w:pPr>
       <w:spacing w:after="0" w:line="240" w:lineRule="auto"/>
     </w:pPr>
@@ -25711,7 +25706,7 @@
     <w:name w:val="Colorful Grid"/>
     <w:basedOn w:val="TableNormal"/>
     <w:uiPriority w:val="73"/>
-    <w:rsid w:val="00DC64AF"/>
+    <w:rsid w:val="00923657"/>
     <w:pPr>
       <w:spacing w:after="0" w:line="240" w:lineRule="auto"/>
     </w:pPr>
@@ -25790,7 +25785,7 @@
     <w:name w:val="Colorful Grid Accent 1"/>
     <w:basedOn w:val="TableNormal"/>
     <w:uiPriority w:val="73"/>
-    <w:rsid w:val="00DC64AF"/>
+    <w:rsid w:val="00923657"/>
     <w:pPr>
       <w:spacing w:after="0" w:line="240" w:lineRule="auto"/>
     </w:pPr>
@@ -25869,7 +25864,7 @@
     <w:name w:val="Colorful Grid Accent 2"/>
     <w:basedOn w:val="TableNormal"/>
     <w:uiPriority w:val="73"/>
-    <w:rsid w:val="00DC64AF"/>
+    <w:rsid w:val="00923657"/>
     <w:pPr>
       <w:spacing w:after="0" w:line="240" w:lineRule="auto"/>
     </w:pPr>
@@ -25948,7 +25943,7 @@
     <w:name w:val="Colorful Grid Accent 3"/>
     <w:basedOn w:val="TableNormal"/>
     <w:uiPriority w:val="73"/>
-    <w:rsid w:val="00DC64AF"/>
+    <w:rsid w:val="00923657"/>
     <w:pPr>
       <w:spacing w:after="0" w:line="240" w:lineRule="auto"/>
     </w:pPr>
@@ -26027,7 +26022,7 @@
     <w:name w:val="Colorful Grid Accent 4"/>
     <w:basedOn w:val="TableNormal"/>
     <w:uiPriority w:val="73"/>
-    <w:rsid w:val="00DC64AF"/>
+    <w:rsid w:val="00923657"/>
     <w:pPr>
       <w:spacing w:after="0" w:line="240" w:lineRule="auto"/>
     </w:pPr>
@@ -26106,7 +26101,7 @@
     <w:name w:val="Colorful Grid Accent 5"/>
     <w:basedOn w:val="TableNormal"/>
     <w:uiPriority w:val="73"/>
-    <w:rsid w:val="00DC64AF"/>
+    <w:rsid w:val="00923657"/>
     <w:pPr>
       <w:spacing w:after="0" w:line="240" w:lineRule="auto"/>
     </w:pPr>
@@ -26185,7 +26180,7 @@
     <w:name w:val="Colorful Grid Accent 6"/>
     <w:basedOn w:val="TableNormal"/>
     <w:uiPriority w:val="73"/>
-    <w:rsid w:val="00DC64AF"/>
+    <w:rsid w:val="00923657"/>
     <w:pPr>
       <w:spacing w:after="0" w:line="240" w:lineRule="auto"/>
     </w:pPr>
@@ -26266,7 +26261,7 @@
     <w:uiPriority w:val="99"/>
     <w:semiHidden/>
     <w:unhideWhenUsed/>
-    <w:rsid w:val="00DC64AF"/>
+    <w:rsid w:val="00923657"/>
     <w:rPr>
       <w:color w:val="605E5C"/>
       <w:shd w:val="clear" w:color="auto" w:fill="E1DFDD"/>

</xml_diff>